<commit_message>
last off js 05
</commit_message>
<xml_diff>
--- a/laporan/TI-3B _2341720163_Satrio Ahmad Ramadhani_J4.docx
+++ b/laporan/TI-3B _2341720163_Satrio Ahmad Ramadhani_J4.docx
@@ -22,13 +22,10 @@
           <w:sz w:val="40"/>
           <w:szCs w:val="40"/>
         </w:rPr>
-        <w:t>Laporan Tugas Pratikum</w:t>
-      </w:r>
-    </w:p>
-    <w:p>
-      <w:pPr>
-        <w:spacing w:line="360" w:lineRule="auto"/>
-        <w:jc w:val="center"/>
+        <w:t xml:space="preserve">Laporan Tugas </w:t>
+      </w:r>
+      <w:proofErr w:type="spellStart"/>
+      <w:r>
         <w:rPr>
           <w:rFonts w:ascii="Times New Roman" w:eastAsia="SimSun" w:hAnsi="Times New Roman" w:cs="Times New Roman"/>
           <w:b/>
@@ -36,8 +33,14 @@
           <w:sz w:val="40"/>
           <w:szCs w:val="40"/>
         </w:rPr>
-      </w:pPr>
-      <w:r>
+        <w:t>Pratikum</w:t>
+      </w:r>
+      <w:proofErr w:type="spellEnd"/>
+    </w:p>
+    <w:p>
+      <w:pPr>
+        <w:spacing w:line="360" w:lineRule="auto"/>
+        <w:jc w:val="center"/>
         <w:rPr>
           <w:rFonts w:ascii="Times New Roman" w:eastAsia="SimSun" w:hAnsi="Times New Roman" w:cs="Times New Roman"/>
           <w:b/>
@@ -45,7 +48,28 @@
           <w:sz w:val="40"/>
           <w:szCs w:val="40"/>
         </w:rPr>
-        <w:t>Jobsheet 4</w:t>
+      </w:pPr>
+      <w:proofErr w:type="spellStart"/>
+      <w:r>
+        <w:rPr>
+          <w:rFonts w:ascii="Times New Roman" w:eastAsia="SimSun" w:hAnsi="Times New Roman" w:cs="Times New Roman"/>
+          <w:b/>
+          <w:bCs/>
+          <w:sz w:val="40"/>
+          <w:szCs w:val="40"/>
+        </w:rPr>
+        <w:t>Jobsheet</w:t>
+      </w:r>
+      <w:proofErr w:type="spellEnd"/>
+      <w:r>
+        <w:rPr>
+          <w:rFonts w:ascii="Times New Roman" w:eastAsia="SimSun" w:hAnsi="Times New Roman" w:cs="Times New Roman"/>
+          <w:b/>
+          <w:bCs/>
+          <w:sz w:val="40"/>
+          <w:szCs w:val="40"/>
+        </w:rPr>
+        <w:t xml:space="preserve"> 4</w:t>
       </w:r>
     </w:p>
     <w:p>
@@ -418,9 +442,11 @@
         <w:spacing w:before="182" w:line="403" w:lineRule="auto"/>
         <w:ind w:left="23" w:right="2093"/>
       </w:pPr>
+      <w:proofErr w:type="spellStart"/>
       <w:r>
         <w:t>Styling</w:t>
       </w:r>
+      <w:proofErr w:type="spellEnd"/>
       <w:r>
         <w:rPr>
           <w:spacing w:val="-4"/>
@@ -472,8 +498,13 @@
         </w:rPr>
         <w:t xml:space="preserve"> </w:t>
       </w:r>
-      <w:r>
-        <w:t>Module,</w:t>
+      <w:proofErr w:type="spellStart"/>
+      <w:r>
+        <w:t>Module</w:t>
+      </w:r>
+      <w:proofErr w:type="spellEnd"/>
+      <w:r>
+        <w:t>,</w:t>
       </w:r>
       <w:r>
         <w:rPr>
@@ -481,17 +512,24 @@
         </w:rPr>
         <w:t xml:space="preserve"> </w:t>
       </w:r>
+      <w:proofErr w:type="spellStart"/>
       <w:r>
         <w:t>Inline</w:t>
       </w:r>
+      <w:proofErr w:type="spellEnd"/>
       <w:r>
         <w:rPr>
           <w:spacing w:val="-4"/>
         </w:rPr>
         <w:t xml:space="preserve"> </w:t>
       </w:r>
-      <w:r>
-        <w:t>Style,</w:t>
+      <w:proofErr w:type="spellStart"/>
+      <w:r>
+        <w:t>Style</w:t>
+      </w:r>
+      <w:proofErr w:type="spellEnd"/>
+      <w:r>
+        <w:t>,</w:t>
       </w:r>
       <w:r>
         <w:rPr>
@@ -517,9 +555,11 @@
         </w:rPr>
         <w:t xml:space="preserve"> </w:t>
       </w:r>
+      <w:proofErr w:type="spellStart"/>
       <w:r>
         <w:t>Tailwind</w:t>
       </w:r>
+      <w:proofErr w:type="spellEnd"/>
       <w:r>
         <w:rPr>
           <w:spacing w:val="-4"/>
@@ -548,11 +588,19 @@
         </w:rPr>
         <w:t xml:space="preserve"> </w:t>
       </w:r>
-      <w:r>
-        <w:rPr>
-          <w:spacing w:val="-2"/>
-        </w:rPr>
-        <w:t xml:space="preserve">Framework </w:t>
+      <w:proofErr w:type="spellStart"/>
+      <w:r>
+        <w:rPr>
+          <w:spacing w:val="-2"/>
+        </w:rPr>
+        <w:t>Framework</w:t>
+      </w:r>
+      <w:proofErr w:type="spellEnd"/>
+      <w:r>
+        <w:rPr>
+          <w:spacing w:val="-2"/>
+        </w:rPr>
+        <w:t xml:space="preserve"> </w:t>
       </w:r>
       <w:r>
         <w:t>Topik Praktikum</w:t>
@@ -573,9 +621,11 @@
         </w:rPr>
         <w:t xml:space="preserve"> </w:t>
       </w:r>
+      <w:proofErr w:type="spellStart"/>
       <w:r>
         <w:t>Styling</w:t>
       </w:r>
+      <w:proofErr w:type="spellEnd"/>
       <w:r>
         <w:rPr>
           <w:spacing w:val="-12"/>
@@ -601,16 +651,26 @@
         <w:t xml:space="preserve"> </w:t>
       </w:r>
       <w:r>
-        <w:t>(Pages</w:t>
-      </w:r>
+        <w:t>(</w:t>
+      </w:r>
+      <w:proofErr w:type="spellStart"/>
+      <w:r>
+        <w:t>Pages</w:t>
+      </w:r>
+      <w:proofErr w:type="spellEnd"/>
       <w:r>
         <w:rPr>
           <w:spacing w:val="-13"/>
         </w:rPr>
         <w:t xml:space="preserve"> </w:t>
       </w:r>
-      <w:r>
-        <w:t>Router) Alokasi Waktu</w:t>
+      <w:proofErr w:type="spellStart"/>
+      <w:r>
+        <w:t>Router</w:t>
+      </w:r>
+      <w:proofErr w:type="spellEnd"/>
+      <w:r>
+        <w:t>) Alokasi Waktu</w:t>
       </w:r>
     </w:p>
     <w:p>
@@ -994,7 +1054,7 @@
           </mc:Choice>
           <mc:Fallback>
             <w:pict>
-              <v:group w14:anchorId="38D3AEDC" id="Group 1" o:spid="_x0000_s1026" style="position:absolute;margin-left:1in;margin-top:18.25pt;width:451.4pt;height:1.55pt;z-index:-15728640;mso-wrap-distance-left:0;mso-wrap-distance-right:0;mso-position-horizontal-relative:page" coordsize="57327,196" o:gfxdata="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">
+              <v:group w14:anchorId="68445B5D" id="Group 1" o:spid="_x0000_s1026" style="position:absolute;margin-left:1in;margin-top:18.25pt;width:451.4pt;height:1.55pt;z-index:-15728640;mso-wrap-distance-left:0;mso-wrap-distance-right:0;mso-position-horizontal-relative:page" coordsize="57327,196" o:gfxdata="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">
                 <v:shape id="Graphic 2" o:spid="_x0000_s1027" style="position:absolute;width:57315;height:190;visibility:visible;mso-wrap-style:square;v-text-anchor:top" coordsize="5731510,19050" o:gfxdata="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" path="m5731497,l,,,266,,2794,,19050r5731497,l5731497,xe" fillcolor="#9f9f9f" stroked="f">
                   <v:path arrowok="t"/>
                 </v:shape>
@@ -1150,9 +1210,11 @@
         </w:rPr>
         <w:t xml:space="preserve"> </w:t>
       </w:r>
+      <w:proofErr w:type="spellStart"/>
       <w:r>
         <w:t>styling</w:t>
       </w:r>
+      <w:proofErr w:type="spellEnd"/>
       <w:r>
         <w:rPr>
           <w:spacing w:val="-5"/>
@@ -1263,9 +1325,11 @@
         </w:rPr>
         <w:t xml:space="preserve"> </w:t>
       </w:r>
+      <w:proofErr w:type="spellStart"/>
       <w:r>
         <w:t>Module</w:t>
       </w:r>
+      <w:proofErr w:type="spellEnd"/>
       <w:r>
         <w:rPr>
           <w:spacing w:val="-5"/>
@@ -1273,19 +1337,32 @@
         <w:t xml:space="preserve"> </w:t>
       </w:r>
       <w:r>
-        <w:t>(local</w:t>
-      </w:r>
+        <w:t>(</w:t>
+      </w:r>
+      <w:proofErr w:type="spellStart"/>
+      <w:r>
+        <w:t>local</w:t>
+      </w:r>
+      <w:proofErr w:type="spellEnd"/>
       <w:r>
         <w:rPr>
           <w:spacing w:val="-5"/>
         </w:rPr>
         <w:t xml:space="preserve"> </w:t>
       </w:r>
-      <w:r>
-        <w:rPr>
-          <w:spacing w:val="-2"/>
-        </w:rPr>
-        <w:t>scope)</w:t>
+      <w:proofErr w:type="spellStart"/>
+      <w:r>
+        <w:rPr>
+          <w:spacing w:val="-2"/>
+        </w:rPr>
+        <w:t>scope</w:t>
+      </w:r>
+      <w:proofErr w:type="spellEnd"/>
+      <w:r>
+        <w:rPr>
+          <w:spacing w:val="-2"/>
+        </w:rPr>
+        <w:t>)</w:t>
       </w:r>
     </w:p>
     <w:p>
@@ -1310,18 +1387,22 @@
         </w:rPr>
         <w:t xml:space="preserve"> </w:t>
       </w:r>
+      <w:proofErr w:type="spellStart"/>
       <w:r>
         <w:t>Inline</w:t>
       </w:r>
+      <w:proofErr w:type="spellEnd"/>
       <w:r>
         <w:rPr>
           <w:spacing w:val="-4"/>
         </w:rPr>
         <w:t xml:space="preserve"> </w:t>
       </w:r>
+      <w:proofErr w:type="spellStart"/>
       <w:r>
         <w:t>Styling</w:t>
       </w:r>
+      <w:proofErr w:type="spellEnd"/>
       <w:r>
         <w:rPr>
           <w:spacing w:val="-4"/>
@@ -1405,9 +1486,11 @@
         </w:rPr>
         <w:t xml:space="preserve"> </w:t>
       </w:r>
+      <w:proofErr w:type="spellStart"/>
       <w:r>
         <w:t>style</w:t>
       </w:r>
+      <w:proofErr w:type="spellEnd"/>
       <w:r>
         <w:rPr>
           <w:spacing w:val="-4"/>
@@ -1451,9 +1534,11 @@
         </w:rPr>
         <w:t xml:space="preserve"> </w:t>
       </w:r>
+      <w:proofErr w:type="spellStart"/>
       <w:r>
         <w:t>refactoring</w:t>
       </w:r>
+      <w:proofErr w:type="spellEnd"/>
       <w:r>
         <w:rPr>
           <w:spacing w:val="-8"/>
@@ -1487,9 +1572,11 @@
         </w:rPr>
         <w:t xml:space="preserve"> </w:t>
       </w:r>
+      <w:proofErr w:type="spellStart"/>
       <w:r>
         <w:t>project</w:t>
       </w:r>
+      <w:proofErr w:type="spellEnd"/>
       <w:r>
         <w:rPr>
           <w:spacing w:val="-7"/>
@@ -1505,12 +1592,14 @@
         </w:rPr>
         <w:t xml:space="preserve"> </w:t>
       </w:r>
+      <w:proofErr w:type="spellStart"/>
       <w:r>
         <w:rPr>
           <w:spacing w:val="-2"/>
         </w:rPr>
         <w:t>maintainable</w:t>
       </w:r>
+      <w:proofErr w:type="spellEnd"/>
     </w:p>
     <w:p>
       <w:pPr>
@@ -1534,9 +1623,11 @@
         </w:rPr>
         <w:t xml:space="preserve"> </w:t>
       </w:r>
+      <w:proofErr w:type="spellStart"/>
       <w:r>
         <w:t>Tailwind</w:t>
       </w:r>
+      <w:proofErr w:type="spellEnd"/>
       <w:r>
         <w:rPr>
           <w:spacing w:val="-11"/>
@@ -1570,21 +1661,25 @@
         </w:rPr>
         <w:t xml:space="preserve"> </w:t>
       </w:r>
+      <w:proofErr w:type="spellStart"/>
       <w:r>
         <w:t>Pages</w:t>
       </w:r>
+      <w:proofErr w:type="spellEnd"/>
       <w:r>
         <w:rPr>
           <w:spacing w:val="-10"/>
         </w:rPr>
         <w:t xml:space="preserve"> </w:t>
       </w:r>
+      <w:proofErr w:type="spellStart"/>
       <w:r>
         <w:rPr>
           <w:spacing w:val="-2"/>
         </w:rPr>
         <w:t>Router</w:t>
       </w:r>
+      <w:proofErr w:type="spellEnd"/>
     </w:p>
     <w:p>
       <w:pPr>
@@ -1952,7 +2047,7 @@
           </mc:Choice>
           <mc:Fallback>
             <w:pict>
-              <v:group w14:anchorId="53C2977A" id="Group 8" o:spid="_x0000_s1026" style="position:absolute;margin-left:1in;margin-top:18.45pt;width:451.4pt;height:1.55pt;z-index:-15728128;mso-wrap-distance-left:0;mso-wrap-distance-right:0;mso-position-horizontal-relative:page" coordsize="57327,196" o:gfxdata="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">
+              <v:group w14:anchorId="5EAA6CD7" id="Group 8" o:spid="_x0000_s1026" style="position:absolute;margin-left:1in;margin-top:18.45pt;width:451.4pt;height:1.55pt;z-index:-15728128;mso-wrap-distance-left:0;mso-wrap-distance-right:0;mso-position-horizontal-relative:page" coordsize="57327,196" o:gfxdata="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">
                 <v:shape id="Graphic 9" o:spid="_x0000_s1027" style="position:absolute;width:57315;height:190;visibility:visible;mso-wrap-style:square;v-text-anchor:top" coordsize="5731510,19050" o:gfxdata="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" path="m5731497,l,,,635,,3175,,19050r5731497,l5731497,xe" fillcolor="#9f9f9f" stroked="f">
                   <v:path arrowok="t"/>
                 </v:shape>
@@ -1991,9 +2086,11 @@
         <w:spacing w:before="232"/>
         <w:ind w:left="246" w:hanging="223"/>
       </w:pPr>
+      <w:proofErr w:type="spellStart"/>
       <w:r>
         <w:t>Tools</w:t>
       </w:r>
+      <w:proofErr w:type="spellEnd"/>
       <w:r>
         <w:rPr>
           <w:spacing w:val="-12"/>
@@ -2156,16 +2253,26 @@
         <w:t xml:space="preserve"> </w:t>
       </w:r>
       <w:r>
-        <w:t>(Pages</w:t>
-      </w:r>
+        <w:t>(</w:t>
+      </w:r>
+      <w:proofErr w:type="spellStart"/>
+      <w:r>
+        <w:t>Pages</w:t>
+      </w:r>
+      <w:proofErr w:type="spellEnd"/>
       <w:r>
         <w:rPr>
           <w:spacing w:val="-12"/>
         </w:rPr>
         <w:t xml:space="preserve"> </w:t>
       </w:r>
-      <w:r>
-        <w:t>Router,</w:t>
+      <w:proofErr w:type="spellStart"/>
+      <w:r>
+        <w:t>Router</w:t>
+      </w:r>
+      <w:proofErr w:type="spellEnd"/>
+      <w:r>
+        <w:t>,</w:t>
       </w:r>
       <w:r>
         <w:rPr>
@@ -2173,11 +2280,19 @@
         </w:rPr>
         <w:t xml:space="preserve"> </w:t>
       </w:r>
-      <w:r>
-        <w:rPr>
-          <w:spacing w:val="-2"/>
-        </w:rPr>
-        <w:t>TypeScript)</w:t>
+      <w:proofErr w:type="spellStart"/>
+      <w:r>
+        <w:rPr>
+          <w:spacing w:val="-2"/>
+        </w:rPr>
+        <w:t>TypeScript</w:t>
+      </w:r>
+      <w:proofErr w:type="spellEnd"/>
+      <w:r>
+        <w:rPr>
+          <w:spacing w:val="-2"/>
+        </w:rPr>
+        <w:t>)</w:t>
       </w:r>
     </w:p>
     <w:p>
@@ -2192,30 +2307,36 @@
         </w:tabs>
         <w:spacing w:before="181"/>
       </w:pPr>
+      <w:proofErr w:type="spellStart"/>
       <w:r>
         <w:t>npm</w:t>
       </w:r>
-      <w:r>
-        <w:rPr>
-          <w:spacing w:val="-2"/>
-        </w:rPr>
-        <w:t xml:space="preserve"> </w:t>
-      </w:r>
+      <w:proofErr w:type="spellEnd"/>
+      <w:r>
+        <w:rPr>
+          <w:spacing w:val="-2"/>
+        </w:rPr>
+        <w:t xml:space="preserve"> </w:t>
+      </w:r>
+      <w:proofErr w:type="spellStart"/>
       <w:r>
         <w:t>run</w:t>
       </w:r>
+      <w:proofErr w:type="spellEnd"/>
       <w:r>
         <w:rPr>
           <w:spacing w:val="-1"/>
         </w:rPr>
         <w:t xml:space="preserve"> </w:t>
       </w:r>
+      <w:proofErr w:type="spellStart"/>
       <w:r>
         <w:rPr>
           <w:spacing w:val="-5"/>
         </w:rPr>
         <w:t>dev</w:t>
       </w:r>
+      <w:proofErr w:type="spellEnd"/>
     </w:p>
     <w:p>
       <w:pPr>
@@ -2583,7 +2704,7 @@
           </mc:Choice>
           <mc:Fallback>
             <w:pict>
-              <v:group w14:anchorId="4C42C10B" id="Group 15" o:spid="_x0000_s1026" style="position:absolute;margin-left:1in;margin-top:18.4pt;width:451.4pt;height:1.6pt;z-index:-15727616;mso-wrap-distance-left:0;mso-wrap-distance-right:0;mso-position-horizontal-relative:page" coordsize="57327,203" o:gfxdata="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">
+              <v:group w14:anchorId="4F9810BC" id="Group 15" o:spid="_x0000_s1026" style="position:absolute;margin-left:1in;margin-top:18.4pt;width:451.4pt;height:1.6pt;z-index:-15727616;mso-wrap-distance-left:0;mso-wrap-distance-right:0;mso-position-horizontal-relative:page" coordsize="57327,203" o:gfxdata="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">
                 <v:shape id="Graphic 16" o:spid="_x0000_s1027" style="position:absolute;width:57315;height:190;visibility:visible;mso-wrap-style:square;v-text-anchor:top" coordsize="5731510,19050" o:gfxdata="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" path="m5731497,l,,,1016,,3556,,19050r5731497,l5731497,xe" fillcolor="#9f9f9f" stroked="f">
                   <v:path arrowok="t"/>
                 </v:shape>
@@ -2640,9 +2761,11 @@
         </w:rPr>
         <w:t xml:space="preserve"> </w:t>
       </w:r>
+      <w:proofErr w:type="spellStart"/>
       <w:r>
         <w:t>Styling</w:t>
       </w:r>
+      <w:proofErr w:type="spellEnd"/>
       <w:r>
         <w:rPr>
           <w:spacing w:val="-3"/>
@@ -2707,11 +2830,19 @@
         </w:rPr>
         <w:t xml:space="preserve"> </w:t>
       </w:r>
-      <w:r>
-        <w:rPr>
-          <w:spacing w:val="-2"/>
-        </w:rPr>
-        <w:t>styling:</w:t>
+      <w:proofErr w:type="spellStart"/>
+      <w:r>
+        <w:rPr>
+          <w:spacing w:val="-2"/>
+        </w:rPr>
+        <w:t>styling</w:t>
+      </w:r>
+      <w:proofErr w:type="spellEnd"/>
+      <w:r>
+        <w:rPr>
+          <w:spacing w:val="-2"/>
+        </w:rPr>
+        <w:t>:</w:t>
       </w:r>
     </w:p>
     <w:p>
@@ -2762,8 +2893,16 @@
         <w:rPr>
           <w:spacing w:val="-2"/>
         </w:rPr>
-        <w:t xml:space="preserve"> Module</w:t>
-      </w:r>
+        <w:t xml:space="preserve"> </w:t>
+      </w:r>
+      <w:proofErr w:type="spellStart"/>
+      <w:r>
+        <w:rPr>
+          <w:spacing w:val="-2"/>
+        </w:rPr>
+        <w:t>Module</w:t>
+      </w:r>
+      <w:proofErr w:type="spellEnd"/>
     </w:p>
     <w:p>
       <w:pPr>
@@ -2789,19 +2928,23 @@
         <w:spacing w:before="42"/>
         <w:ind w:left="741" w:hanging="358"/>
       </w:pPr>
+      <w:proofErr w:type="spellStart"/>
       <w:r>
         <w:lastRenderedPageBreak/>
         <w:t>Inline</w:t>
       </w:r>
+      <w:proofErr w:type="spellEnd"/>
       <w:r>
         <w:rPr>
           <w:spacing w:val="-4"/>
         </w:rPr>
         <w:t xml:space="preserve"> </w:t>
       </w:r>
+      <w:proofErr w:type="spellStart"/>
       <w:r>
         <w:t>Style</w:t>
       </w:r>
+      <w:proofErr w:type="spellEnd"/>
       <w:r>
         <w:rPr>
           <w:spacing w:val="-4"/>
@@ -2867,9 +3010,11 @@
         </w:tabs>
         <w:ind w:left="741" w:hanging="358"/>
       </w:pPr>
+      <w:proofErr w:type="spellStart"/>
       <w:r>
         <w:t>Utility-first</w:t>
       </w:r>
+      <w:proofErr w:type="spellEnd"/>
       <w:r>
         <w:rPr>
           <w:spacing w:val="-12"/>
@@ -2885,9 +3030,11 @@
         </w:rPr>
         <w:t xml:space="preserve"> </w:t>
       </w:r>
+      <w:proofErr w:type="spellStart"/>
       <w:r>
         <w:t>Framework</w:t>
       </w:r>
+      <w:proofErr w:type="spellEnd"/>
       <w:r>
         <w:rPr>
           <w:spacing w:val="-11"/>
@@ -2895,8 +3042,13 @@
         <w:t xml:space="preserve"> </w:t>
       </w:r>
       <w:r>
-        <w:t>(Tailwind</w:t>
-      </w:r>
+        <w:t>(</w:t>
+      </w:r>
+      <w:proofErr w:type="spellStart"/>
+      <w:r>
+        <w:t>Tailwind</w:t>
+      </w:r>
+      <w:proofErr w:type="spellEnd"/>
       <w:r>
         <w:rPr>
           <w:spacing w:val="-12"/>
@@ -2912,8 +3064,13 @@
         </w:rPr>
         <w:t xml:space="preserve"> </w:t>
       </w:r>
-      <w:r>
-        <w:t>Bootstrap,</w:t>
+      <w:proofErr w:type="spellStart"/>
+      <w:r>
+        <w:t>Bootstrap</w:t>
+      </w:r>
+      <w:proofErr w:type="spellEnd"/>
+      <w:r>
+        <w:t>,</w:t>
       </w:r>
       <w:r>
         <w:rPr>
@@ -2921,11 +3078,19 @@
         </w:rPr>
         <w:t xml:space="preserve"> </w:t>
       </w:r>
+      <w:proofErr w:type="spellStart"/>
       <w:r>
         <w:rPr>
           <w:spacing w:val="-4"/>
         </w:rPr>
-        <w:t>dll)</w:t>
+        <w:t>dll</w:t>
+      </w:r>
+      <w:proofErr w:type="spellEnd"/>
+      <w:r>
+        <w:rPr>
+          <w:spacing w:val="-4"/>
+        </w:rPr>
+        <w:t>)</w:t>
       </w:r>
     </w:p>
     <w:p>
@@ -3294,7 +3459,7 @@
           </mc:Choice>
           <mc:Fallback>
             <w:pict>
-              <v:group w14:anchorId="79B4B075" id="Group 22" o:spid="_x0000_s1026" style="position:absolute;margin-left:1in;margin-top:18.4pt;width:451.4pt;height:1.55pt;z-index:-15727104;mso-wrap-distance-left:0;mso-wrap-distance-right:0;mso-position-horizontal-relative:page" coordsize="57327,196" o:gfxdata="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">
+              <v:group w14:anchorId="7DECD43D" id="Group 22" o:spid="_x0000_s1026" style="position:absolute;margin-left:1in;margin-top:18.4pt;width:451.4pt;height:1.55pt;z-index:-15727104;mso-wrap-distance-left:0;mso-wrap-distance-right:0;mso-position-horizontal-relative:page" coordsize="57327,196" o:gfxdata="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">
                 <v:shape id="Graphic 23" o:spid="_x0000_s1027" style="position:absolute;width:57315;height:190;visibility:visible;mso-wrap-style:square;v-text-anchor:top" coordsize="5731510,19050" o:gfxdata="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" path="m5731497,l,,,254,,2794,,19050r5731497,l5731497,xe" fillcolor="#9f9f9f" stroked="f">
                   <v:path arrowok="t"/>
                 </v:shape>
@@ -3715,7 +3880,7 @@
           </mc:Choice>
           <mc:Fallback>
             <w:pict>
-              <v:group w14:anchorId="50B181F8" id="Group 29" o:spid="_x0000_s1026" style="position:absolute;margin-left:1in;margin-top:18.45pt;width:451.4pt;height:1.55pt;z-index:-15726592;mso-wrap-distance-left:0;mso-wrap-distance-right:0;mso-position-horizontal-relative:page" coordsize="57327,196" o:gfxdata="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">
+              <v:group w14:anchorId="310100ED" id="Group 29" o:spid="_x0000_s1026" style="position:absolute;margin-left:1in;margin-top:18.45pt;width:451.4pt;height:1.55pt;z-index:-15726592;mso-wrap-distance-left:0;mso-wrap-distance-right:0;mso-position-horizontal-relative:page" coordsize="57327,196" o:gfxdata="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">
                 <v:shape id="Graphic 30" o:spid="_x0000_s1027" style="position:absolute;width:57315;height:190;visibility:visible;mso-wrap-style:square;v-text-anchor:top" coordsize="5731510,19050" o:gfxdata="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" path="m5731497,l,,,254,,2794,,19050r5731497,l5731497,xe" fillcolor="#9f9f9f" stroked="f">
                   <v:path arrowok="t"/>
                 </v:shape>
@@ -3793,12 +3958,14 @@
           <w:b/>
         </w:rPr>
       </w:pPr>
+      <w:proofErr w:type="spellStart"/>
       <w:r>
         <w:rPr>
           <w:b/>
         </w:rPr>
         <w:t>File</w:t>
       </w:r>
+      <w:proofErr w:type="spellEnd"/>
       <w:r>
         <w:rPr>
           <w:b/>
@@ -3891,12 +4058,14 @@
           <w:b/>
         </w:rPr>
       </w:pPr>
+      <w:proofErr w:type="spellStart"/>
       <w:r>
         <w:rPr>
           <w:b/>
         </w:rPr>
         <w:t>Import</w:t>
       </w:r>
+      <w:proofErr w:type="spellEnd"/>
       <w:r>
         <w:rPr>
           <w:b/>
@@ -3938,8 +4107,30 @@
         <w:rPr>
           <w:spacing w:val="-2"/>
         </w:rPr>
-        <w:t xml:space="preserve"> pages/_app.tsx</w:t>
-      </w:r>
+        <w:t xml:space="preserve"> </w:t>
+      </w:r>
+      <w:proofErr w:type="spellStart"/>
+      <w:r>
+        <w:rPr>
+          <w:spacing w:val="-2"/>
+        </w:rPr>
+        <w:t>pages</w:t>
+      </w:r>
+      <w:proofErr w:type="spellEnd"/>
+      <w:r>
+        <w:rPr>
+          <w:spacing w:val="-2"/>
+        </w:rPr>
+        <w:t>/_</w:t>
+      </w:r>
+      <w:proofErr w:type="spellStart"/>
+      <w:r>
+        <w:rPr>
+          <w:spacing w:val="-2"/>
+        </w:rPr>
+        <w:t>app.tsx</w:t>
+      </w:r>
+      <w:proofErr w:type="spellEnd"/>
     </w:p>
     <w:p>
       <w:pPr>
@@ -3947,14 +4138,33 @@
         <w:spacing w:before="181"/>
         <w:ind w:left="23"/>
       </w:pPr>
-      <w:r>
-        <w:t xml:space="preserve">import </w:t>
-      </w:r>
-      <w:r>
-        <w:rPr>
-          <w:spacing w:val="-2"/>
-        </w:rPr>
-        <w:t>"@/styles/globals.css";</w:t>
+      <w:proofErr w:type="spellStart"/>
+      <w:r>
+        <w:t>import</w:t>
+      </w:r>
+      <w:proofErr w:type="spellEnd"/>
+      <w:r>
+        <w:t xml:space="preserve"> </w:t>
+      </w:r>
+      <w:r>
+        <w:rPr>
+          <w:spacing w:val="-2"/>
+        </w:rPr>
+        <w:t>"@/</w:t>
+      </w:r>
+      <w:proofErr w:type="spellStart"/>
+      <w:r>
+        <w:rPr>
+          <w:spacing w:val="-2"/>
+        </w:rPr>
+        <w:t>styles</w:t>
+      </w:r>
+      <w:proofErr w:type="spellEnd"/>
+      <w:r>
+        <w:rPr>
+          <w:spacing w:val="-2"/>
+        </w:rPr>
+        <w:t>/globals.css";</w:t>
       </w:r>
     </w:p>
     <w:p>
@@ -4151,12 +4361,14 @@
         </w:rPr>
         <w:t xml:space="preserve"> </w:t>
       </w:r>
+      <w:proofErr w:type="spellStart"/>
       <w:r>
         <w:rPr>
           <w:b/>
         </w:rPr>
         <w:t>di-import</w:t>
       </w:r>
+      <w:proofErr w:type="spellEnd"/>
       <w:r>
         <w:rPr>
           <w:b/>
@@ -4175,8 +4387,17 @@
           <w:b/>
           <w:spacing w:val="-2"/>
         </w:rPr>
-        <w:t xml:space="preserve"> _app.tsx</w:t>
-      </w:r>
+        <w:t xml:space="preserve"> _</w:t>
+      </w:r>
+      <w:proofErr w:type="spellStart"/>
+      <w:r>
+        <w:rPr>
+          <w:b/>
+          <w:spacing w:val="-2"/>
+        </w:rPr>
+        <w:t>app.tsx</w:t>
+      </w:r>
+      <w:proofErr w:type="spellEnd"/>
     </w:p>
     <w:p>
       <w:pPr>
@@ -4610,7 +4831,7 @@
           </mc:Choice>
           <mc:Fallback>
             <w:pict>
-              <v:group w14:anchorId="42232E1B" id="Group 38" o:spid="_x0000_s1026" style="width:451.4pt;height:1.5pt;mso-position-horizontal-relative:char;mso-position-vertical-relative:line" coordsize="57327,190" o:gfxdata="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">
+              <v:group w14:anchorId="6BE6A4E1" id="Group 38" o:spid="_x0000_s1026" style="width:451.4pt;height:1.5pt;mso-position-horizontal-relative:char;mso-position-vertical-relative:line" coordsize="57327,190" o:gfxdata="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">
                 <v:shape id="Graphic 39" o:spid="_x0000_s1027" style="position:absolute;width:57315;height:190;visibility:visible;mso-wrap-style:square;v-text-anchor:top" coordsize="5731510,19050" o:gfxdata="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" path="m5731497,r-1638,l2540,,,,,2540,,19050r5731497,l5731497,xe" fillcolor="#9f9f9f" stroked="f">
                   <v:path arrowok="t"/>
                 </v:shape>
@@ -4665,12 +4886,14 @@
         </w:rPr>
         <w:t xml:space="preserve"> </w:t>
       </w:r>
+      <w:proofErr w:type="spellStart"/>
       <w:r>
         <w:rPr>
           <w:b/>
         </w:rPr>
         <w:t>Module</w:t>
       </w:r>
+      <w:proofErr w:type="spellEnd"/>
       <w:r>
         <w:rPr>
           <w:b/>
@@ -4682,8 +4905,16 @@
         <w:rPr>
           <w:b/>
         </w:rPr>
-        <w:t>(Local</w:t>
-      </w:r>
+        <w:t>(</w:t>
+      </w:r>
+      <w:proofErr w:type="spellStart"/>
+      <w:r>
+        <w:rPr>
+          <w:b/>
+        </w:rPr>
+        <w:t>Local</w:t>
+      </w:r>
+      <w:proofErr w:type="spellEnd"/>
       <w:r>
         <w:rPr>
           <w:b/>
@@ -4691,12 +4922,21 @@
         </w:rPr>
         <w:t xml:space="preserve"> </w:t>
       </w:r>
-      <w:r>
-        <w:rPr>
-          <w:b/>
-          <w:spacing w:val="-2"/>
-        </w:rPr>
-        <w:t>Scope)</w:t>
+      <w:proofErr w:type="spellStart"/>
+      <w:r>
+        <w:rPr>
+          <w:b/>
+          <w:spacing w:val="-2"/>
+        </w:rPr>
+        <w:t>Scope</w:t>
+      </w:r>
+      <w:proofErr w:type="spellEnd"/>
+      <w:r>
+        <w:rPr>
+          <w:b/>
+          <w:spacing w:val="-2"/>
+        </w:rPr>
+        <w:t>)</w:t>
       </w:r>
     </w:p>
     <w:p>
@@ -4740,6 +4980,7 @@
         </w:rPr>
         <w:t xml:space="preserve"> </w:t>
       </w:r>
+      <w:proofErr w:type="spellStart"/>
       <w:r>
         <w:rPr>
           <w:b/>
@@ -4747,17 +4988,68 @@
         </w:rPr>
         <w:t>Navbar</w:t>
       </w:r>
+      <w:proofErr w:type="spellEnd"/>
     </w:p>
     <w:p>
       <w:pPr>
         <w:pStyle w:val="TeksIsi"/>
         <w:spacing w:before="182"/>
       </w:pPr>
-      <w:r>
-        <w:rPr>
-          <w:spacing w:val="-2"/>
-        </w:rPr>
-        <w:t>src/components/layout/Navbar/</w:t>
+      <w:proofErr w:type="spellStart"/>
+      <w:r>
+        <w:rPr>
+          <w:spacing w:val="-2"/>
+        </w:rPr>
+        <w:t>src</w:t>
+      </w:r>
+      <w:proofErr w:type="spellEnd"/>
+      <w:r>
+        <w:rPr>
+          <w:spacing w:val="-2"/>
+        </w:rPr>
+        <w:t>/</w:t>
+      </w:r>
+      <w:proofErr w:type="spellStart"/>
+      <w:r>
+        <w:rPr>
+          <w:spacing w:val="-2"/>
+        </w:rPr>
+        <w:t>components</w:t>
+      </w:r>
+      <w:proofErr w:type="spellEnd"/>
+      <w:r>
+        <w:rPr>
+          <w:spacing w:val="-2"/>
+        </w:rPr>
+        <w:t>/</w:t>
+      </w:r>
+      <w:proofErr w:type="spellStart"/>
+      <w:r>
+        <w:rPr>
+          <w:spacing w:val="-2"/>
+        </w:rPr>
+        <w:t>layout</w:t>
+      </w:r>
+      <w:proofErr w:type="spellEnd"/>
+      <w:r>
+        <w:rPr>
+          <w:spacing w:val="-2"/>
+        </w:rPr>
+        <w:t>/</w:t>
+      </w:r>
+      <w:proofErr w:type="spellStart"/>
+      <w:r>
+        <w:rPr>
+          <w:spacing w:val="-2"/>
+        </w:rPr>
+        <w:t>Navbar</w:t>
+      </w:r>
+      <w:proofErr w:type="spellEnd"/>
+      <w:r>
+        <w:rPr>
+          <w:spacing w:val="-2"/>
+        </w:rPr>
+        <w:t>/</w:t>
       </w:r>
     </w:p>
     <w:p>
@@ -4775,12 +5067,14 @@
       <w:r>
         <w:t xml:space="preserve">── </w:t>
       </w:r>
+      <w:proofErr w:type="spellStart"/>
       <w:r>
         <w:rPr>
           <w:spacing w:val="-2"/>
         </w:rPr>
         <w:t>index.tsx</w:t>
       </w:r>
+      <w:proofErr w:type="spellEnd"/>
     </w:p>
     <w:p>
       <w:pPr>
@@ -4879,12 +5173,14 @@
           <w:b/>
         </w:rPr>
       </w:pPr>
+      <w:proofErr w:type="spellStart"/>
       <w:r>
         <w:rPr>
           <w:b/>
         </w:rPr>
         <w:t>File</w:t>
       </w:r>
+      <w:proofErr w:type="spellEnd"/>
       <w:r>
         <w:rPr>
           <w:b/>
@@ -4905,6 +5201,7 @@
         </w:rPr>
         <w:t xml:space="preserve"> </w:t>
       </w:r>
+      <w:proofErr w:type="spellStart"/>
       <w:r>
         <w:rPr>
           <w:b/>
@@ -4912,6 +5209,7 @@
         </w:rPr>
         <w:t>Module</w:t>
       </w:r>
+      <w:proofErr w:type="spellEnd"/>
     </w:p>
     <w:p>
       <w:pPr>
@@ -5197,9 +5495,11 @@
         </w:rPr>
         <w:t xml:space="preserve"> </w:t>
       </w:r>
+      <w:proofErr w:type="spellStart"/>
       <w:r>
         <w:t>index.tsx</w:t>
       </w:r>
+      <w:proofErr w:type="spellEnd"/>
       <w:r>
         <w:rPr>
           <w:spacing w:val="-8"/>
@@ -5224,12 +5524,14 @@
         </w:rPr>
         <w:t xml:space="preserve"> </w:t>
       </w:r>
+      <w:proofErr w:type="spellStart"/>
       <w:r>
         <w:rPr>
           <w:spacing w:val="-2"/>
         </w:rPr>
         <w:t>navbar</w:t>
       </w:r>
+      <w:proofErr w:type="spellEnd"/>
     </w:p>
     <w:p>
       <w:pPr>
@@ -5507,13 +5809,23 @@
         </w:rPr>
         <w:t xml:space="preserve"> </w:t>
       </w:r>
+      <w:proofErr w:type="spellStart"/>
       <w:r>
         <w:rPr>
           <w:b/>
           <w:spacing w:val="-2"/>
           <w:w w:val="110"/>
         </w:rPr>
-        <w:t>Module:</w:t>
+        <w:t>Module</w:t>
+      </w:r>
+      <w:proofErr w:type="spellEnd"/>
+      <w:r>
+        <w:rPr>
+          <w:b/>
+          <w:spacing w:val="-2"/>
+          <w:w w:val="110"/>
+        </w:rPr>
+        <w:t>:</w:t>
       </w:r>
     </w:p>
     <w:p>
@@ -5532,9 +5844,11 @@
           <w:sz w:val="20"/>
         </w:rPr>
       </w:pPr>
+      <w:proofErr w:type="spellStart"/>
       <w:r>
         <w:t>Scope</w:t>
       </w:r>
+      <w:proofErr w:type="spellEnd"/>
       <w:r>
         <w:rPr>
           <w:spacing w:val="-2"/>
@@ -5583,8 +5897,16 @@
         <w:rPr>
           <w:spacing w:val="-4"/>
         </w:rPr>
-        <w:t xml:space="preserve"> class</w:t>
-      </w:r>
+        <w:t xml:space="preserve"> </w:t>
+      </w:r>
+      <w:proofErr w:type="spellStart"/>
+      <w:r>
+        <w:rPr>
+          <w:spacing w:val="-4"/>
+        </w:rPr>
+        <w:t>class</w:t>
+      </w:r>
+      <w:proofErr w:type="spellEnd"/>
     </w:p>
     <w:p>
       <w:pPr>
@@ -5629,12 +5951,14 @@
         </w:rPr>
         <w:t xml:space="preserve"> </w:t>
       </w:r>
+      <w:proofErr w:type="spellStart"/>
       <w:r>
         <w:rPr>
           <w:spacing w:val="-2"/>
         </w:rPr>
         <w:t>reusable</w:t>
       </w:r>
+      <w:proofErr w:type="spellEnd"/>
     </w:p>
     <w:p>
       <w:pPr>
@@ -6074,7 +6398,7 @@
           </mc:Choice>
           <mc:Fallback>
             <w:pict>
-              <v:group w14:anchorId="48C1FB8D" id="Group 50" o:spid="_x0000_s1026" style="position:absolute;margin-left:1in;margin-top:18.45pt;width:451.4pt;height:1.55pt;z-index:-15722496;mso-wrap-distance-left:0;mso-wrap-distance-right:0;mso-position-horizontal-relative:page" coordsize="57327,196" o:gfxdata="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">
+              <v:group w14:anchorId="5872B6AB" id="Group 50" o:spid="_x0000_s1026" style="position:absolute;margin-left:1in;margin-top:18.45pt;width:451.4pt;height:1.55pt;z-index:-15722496;mso-wrap-distance-left:0;mso-wrap-distance-right:0;mso-position-horizontal-relative:page" coordsize="57327,196" o:gfxdata="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">
                 <v:shape id="Graphic 51" o:spid="_x0000_s1027" style="position:absolute;width:57315;height:190;visibility:visible;mso-wrap-style:square;v-text-anchor:top" coordsize="5731510,19050" o:gfxdata="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" path="m5731497,l,,,635,,3175,,19050r5731497,l5731497,xe" fillcolor="#9f9f9f" stroked="f">
                   <v:path arrowok="t"/>
                 </v:shape>
@@ -6116,6 +6440,7 @@
           <w:b/>
         </w:rPr>
       </w:pPr>
+      <w:proofErr w:type="spellStart"/>
       <w:r>
         <w:rPr>
           <w:b/>
@@ -6123,6 +6448,7 @@
         <w:lastRenderedPageBreak/>
         <w:t>Styling</w:t>
       </w:r>
+      <w:proofErr w:type="spellEnd"/>
       <w:r>
         <w:rPr>
           <w:b/>
@@ -6143,12 +6469,14 @@
         </w:rPr>
         <w:t xml:space="preserve"> </w:t>
       </w:r>
+      <w:proofErr w:type="spellStart"/>
       <w:r>
         <w:rPr>
           <w:b/>
         </w:rPr>
         <w:t>Pages</w:t>
       </w:r>
+      <w:proofErr w:type="spellEnd"/>
       <w:r>
         <w:rPr>
           <w:b/>
@@ -6169,12 +6497,21 @@
         </w:rPr>
         <w:t xml:space="preserve"> </w:t>
       </w:r>
-      <w:r>
-        <w:rPr>
-          <w:b/>
-          <w:spacing w:val="-2"/>
-        </w:rPr>
-        <w:t>Module)</w:t>
+      <w:proofErr w:type="spellStart"/>
+      <w:r>
+        <w:rPr>
+          <w:b/>
+          <w:spacing w:val="-2"/>
+        </w:rPr>
+        <w:t>Module</w:t>
+      </w:r>
+      <w:proofErr w:type="spellEnd"/>
+      <w:r>
+        <w:rPr>
+          <w:b/>
+          <w:spacing w:val="-2"/>
+        </w:rPr>
+        <w:t>)</w:t>
       </w:r>
     </w:p>
     <w:p>
@@ -6205,12 +6542,14 @@
         </w:rPr>
         <w:t xml:space="preserve"> </w:t>
       </w:r>
+      <w:proofErr w:type="spellStart"/>
       <w:r>
         <w:rPr>
           <w:b/>
         </w:rPr>
         <w:t>Login</w:t>
       </w:r>
+      <w:proofErr w:type="spellEnd"/>
       <w:r>
         <w:rPr>
           <w:b/>
@@ -6218,6 +6557,7 @@
         </w:rPr>
         <w:t xml:space="preserve"> </w:t>
       </w:r>
+      <w:proofErr w:type="spellStart"/>
       <w:r>
         <w:rPr>
           <w:b/>
@@ -6225,6 +6565,7 @@
         </w:rPr>
         <w:t>Page</w:t>
       </w:r>
+      <w:proofErr w:type="spellEnd"/>
     </w:p>
     <w:p>
       <w:pPr>
@@ -6325,12 +6666,14 @@
         </w:rPr>
         <w:t xml:space="preserve"> </w:t>
       </w:r>
+      <w:proofErr w:type="spellStart"/>
       <w:r>
         <w:rPr>
           <w:spacing w:val="-4"/>
         </w:rPr>
         <w:t>auth</w:t>
       </w:r>
+      <w:proofErr w:type="spellEnd"/>
     </w:p>
     <w:p>
       <w:pPr>
@@ -6447,12 +6790,14 @@
         </w:rPr>
         <w:t xml:space="preserve"> </w:t>
       </w:r>
+      <w:proofErr w:type="spellStart"/>
       <w:r>
         <w:rPr>
           <w:spacing w:val="-2"/>
         </w:rPr>
         <w:t>login.tsx</w:t>
       </w:r>
+      <w:proofErr w:type="spellEnd"/>
     </w:p>
     <w:p>
       <w:pPr>
@@ -6478,24 +6823,28 @@
         </w:rPr>
         <w:t xml:space="preserve"> </w:t>
       </w:r>
+      <w:proofErr w:type="spellStart"/>
       <w:r>
         <w:rPr>
           <w:spacing w:val="-2"/>
         </w:rPr>
         <w:t>import</w:t>
       </w:r>
+      <w:proofErr w:type="spellEnd"/>
       <w:r>
         <w:rPr>
           <w:spacing w:val="3"/>
         </w:rPr>
         <w:t xml:space="preserve"> </w:t>
       </w:r>
+      <w:proofErr w:type="spellStart"/>
       <w:r>
         <w:rPr>
           <w:spacing w:val="-2"/>
         </w:rPr>
         <w:t>styles</w:t>
       </w:r>
+      <w:proofErr w:type="spellEnd"/>
     </w:p>
     <w:p>
       <w:pPr>
@@ -6518,9 +6867,11 @@
         </w:rPr>
         <w:t xml:space="preserve"> </w:t>
       </w:r>
+      <w:proofErr w:type="spellStart"/>
       <w:r>
         <w:t>classname</w:t>
       </w:r>
+      <w:proofErr w:type="spellEnd"/>
       <w:r>
         <w:rPr>
           <w:spacing w:val="-8"/>
@@ -6545,11 +6896,19 @@
         </w:rPr>
         <w:t xml:space="preserve"> </w:t>
       </w:r>
-      <w:r>
-        <w:rPr>
-          <w:spacing w:val="-2"/>
-        </w:rPr>
-        <w:t>styles.login}</w:t>
+      <w:proofErr w:type="spellStart"/>
+      <w:r>
+        <w:rPr>
+          <w:spacing w:val="-2"/>
+        </w:rPr>
+        <w:t>styles.login</w:t>
+      </w:r>
+      <w:proofErr w:type="spellEnd"/>
+      <w:r>
+        <w:rPr>
+          <w:spacing w:val="-2"/>
+        </w:rPr>
+        <w:t>}</w:t>
       </w:r>
     </w:p>
     <w:p>
@@ -7163,7 +7522,7 @@
           </mc:Choice>
           <mc:Fallback>
             <w:pict>
-              <v:group w14:anchorId="6F557059" id="Group 61" o:spid="_x0000_s1026" style="position:absolute;margin-left:81.3pt;margin-top:24.45pt;width:451.4pt;height:1.6pt;z-index:-251654656;mso-wrap-distance-left:0;mso-wrap-distance-right:0;mso-position-horizontal-relative:page" coordsize="57327,203" o:gfxdata="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">
+              <v:group w14:anchorId="3B82FFF2" id="Group 61" o:spid="_x0000_s1026" style="position:absolute;margin-left:81.3pt;margin-top:24.45pt;width:451.4pt;height:1.6pt;z-index:-251654656;mso-wrap-distance-left:0;mso-wrap-distance-right:0;mso-position-horizontal-relative:page" coordsize="57327,203" o:gfxdata="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">
                 <v:shape id="Graphic 62" o:spid="_x0000_s1027" style="position:absolute;width:57315;height:190;visibility:visible;mso-wrap-style:square;v-text-anchor:top" coordsize="5731510,19050" o:gfxdata="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" path="m5731497,l,,,1016,,3556,,19050r5731497,l5731497,xe" fillcolor="#9f9f9f" stroked="f">
                   <v:path arrowok="t"/>
                 </v:shape>
@@ -7209,6 +7568,7 @@
           <w:b/>
         </w:rPr>
       </w:pPr>
+      <w:proofErr w:type="spellStart"/>
       <w:r>
         <w:rPr>
           <w:b/>
@@ -7216,6 +7576,7 @@
         <w:lastRenderedPageBreak/>
         <w:t>Conditional</w:t>
       </w:r>
+      <w:proofErr w:type="spellEnd"/>
       <w:r>
         <w:rPr>
           <w:b/>
@@ -7223,12 +7584,14 @@
         </w:rPr>
         <w:t xml:space="preserve"> </w:t>
       </w:r>
+      <w:proofErr w:type="spellStart"/>
       <w:r>
         <w:rPr>
           <w:b/>
         </w:rPr>
         <w:t>Rendering</w:t>
       </w:r>
+      <w:proofErr w:type="spellEnd"/>
       <w:r>
         <w:rPr>
           <w:b/>
@@ -7236,12 +7599,14 @@
         </w:rPr>
         <w:t xml:space="preserve"> </w:t>
       </w:r>
+      <w:proofErr w:type="spellStart"/>
       <w:r>
         <w:rPr>
           <w:b/>
         </w:rPr>
         <w:t>Navbar</w:t>
       </w:r>
+      <w:proofErr w:type="spellEnd"/>
       <w:r>
         <w:rPr>
           <w:b/>
@@ -7262,12 +7627,14 @@
         </w:rPr>
         <w:t xml:space="preserve"> </w:t>
       </w:r>
+      <w:proofErr w:type="spellStart"/>
       <w:r>
         <w:rPr>
           <w:b/>
         </w:rPr>
         <w:t>Navbar</w:t>
       </w:r>
+      <w:proofErr w:type="spellEnd"/>
       <w:r>
         <w:rPr>
           <w:b/>
@@ -7288,12 +7655,21 @@
         </w:rPr>
         <w:t xml:space="preserve"> </w:t>
       </w:r>
-      <w:r>
-        <w:rPr>
-          <w:b/>
-          <w:spacing w:val="-2"/>
-        </w:rPr>
-        <w:t>Login)</w:t>
+      <w:proofErr w:type="spellStart"/>
+      <w:r>
+        <w:rPr>
+          <w:b/>
+          <w:spacing w:val="-2"/>
+        </w:rPr>
+        <w:t>Login</w:t>
+      </w:r>
+      <w:proofErr w:type="spellEnd"/>
+      <w:r>
+        <w:rPr>
+          <w:b/>
+          <w:spacing w:val="-2"/>
+        </w:rPr>
+        <w:t>)</w:t>
       </w:r>
     </w:p>
     <w:p>
@@ -7319,9 +7695,11 @@
         </w:rPr>
         <w:t xml:space="preserve"> </w:t>
       </w:r>
+      <w:proofErr w:type="spellStart"/>
       <w:r>
         <w:t>index.tsx</w:t>
       </w:r>
+      <w:proofErr w:type="spellEnd"/>
       <w:r>
         <w:rPr>
           <w:spacing w:val="-8"/>
@@ -7346,12 +7724,14 @@
         </w:rPr>
         <w:t xml:space="preserve"> </w:t>
       </w:r>
+      <w:proofErr w:type="spellStart"/>
       <w:r>
         <w:rPr>
           <w:spacing w:val="-2"/>
         </w:rPr>
         <w:t>Appsheel</w:t>
       </w:r>
+      <w:proofErr w:type="spellEnd"/>
     </w:p>
     <w:p>
       <w:pPr>
@@ -7369,9 +7749,11 @@
           <w:rFonts w:ascii="Courier New" w:hAnsi="Courier New"/>
         </w:rPr>
       </w:pPr>
+      <w:proofErr w:type="spellStart"/>
       <w:r>
         <w:t>import</w:t>
       </w:r>
+      <w:proofErr w:type="spellEnd"/>
       <w:r>
         <w:rPr>
           <w:spacing w:val="-3"/>
@@ -7387,9 +7769,11 @@
         </w:rPr>
         <w:t xml:space="preserve"> </w:t>
       </w:r>
+      <w:proofErr w:type="spellStart"/>
       <w:r>
         <w:t>useRouter</w:t>
       </w:r>
+      <w:proofErr w:type="spellEnd"/>
       <w:r>
         <w:rPr>
           <w:spacing w:val="-5"/>
@@ -7405,14 +7789,44 @@
         </w:rPr>
         <w:t xml:space="preserve"> </w:t>
       </w:r>
+      <w:proofErr w:type="spellStart"/>
       <w:r>
         <w:t>from</w:t>
       </w:r>
-      <w:r>
-        <w:rPr>
-          <w:spacing w:val="-2"/>
-        </w:rPr>
-        <w:t xml:space="preserve"> "next/router";</w:t>
+      <w:proofErr w:type="spellEnd"/>
+      <w:r>
+        <w:rPr>
+          <w:spacing w:val="-2"/>
+        </w:rPr>
+        <w:t xml:space="preserve"> "</w:t>
+      </w:r>
+      <w:proofErr w:type="spellStart"/>
+      <w:r>
+        <w:rPr>
+          <w:spacing w:val="-2"/>
+        </w:rPr>
+        <w:t>next</w:t>
+      </w:r>
+      <w:proofErr w:type="spellEnd"/>
+      <w:r>
+        <w:rPr>
+          <w:spacing w:val="-2"/>
+        </w:rPr>
+        <w:t>/</w:t>
+      </w:r>
+      <w:proofErr w:type="spellStart"/>
+      <w:r>
+        <w:rPr>
+          <w:spacing w:val="-2"/>
+        </w:rPr>
+        <w:t>router</w:t>
+      </w:r>
+      <w:proofErr w:type="spellEnd"/>
+      <w:r>
+        <w:rPr>
+          <w:spacing w:val="-2"/>
+        </w:rPr>
+        <w:t>";</w:t>
       </w:r>
     </w:p>
     <w:p>
@@ -7431,18 +7845,22 @@
           <w:rFonts w:ascii="Courier New" w:hAnsi="Courier New"/>
         </w:rPr>
       </w:pPr>
+      <w:proofErr w:type="spellStart"/>
       <w:r>
         <w:t>const</w:t>
       </w:r>
+      <w:proofErr w:type="spellEnd"/>
       <w:r>
         <w:rPr>
           <w:spacing w:val="-7"/>
         </w:rPr>
         <w:t xml:space="preserve"> </w:t>
       </w:r>
+      <w:proofErr w:type="spellStart"/>
       <w:r>
         <w:t>disableNavbar</w:t>
       </w:r>
+      <w:proofErr w:type="spellEnd"/>
       <w:r>
         <w:rPr>
           <w:spacing w:val="-6"/>
@@ -7459,7 +7877,23 @@
         <w:t xml:space="preserve"> </w:t>
       </w:r>
       <w:r>
-        <w:t>["/auth/login",</w:t>
+        <w:t>["/</w:t>
+      </w:r>
+      <w:proofErr w:type="spellStart"/>
+      <w:r>
+        <w:t>auth</w:t>
+      </w:r>
+      <w:proofErr w:type="spellEnd"/>
+      <w:r>
+        <w:t>/</w:t>
+      </w:r>
+      <w:proofErr w:type="spellStart"/>
+      <w:r>
+        <w:t>login</w:t>
+      </w:r>
+      <w:proofErr w:type="spellEnd"/>
+      <w:r>
+        <w:t>",</w:t>
       </w:r>
       <w:r>
         <w:rPr>
@@ -7471,7 +7905,21 @@
         <w:rPr>
           <w:spacing w:val="-2"/>
         </w:rPr>
-        <w:t>"/auth/register"];</w:t>
+        <w:t>"/</w:t>
+      </w:r>
+      <w:proofErr w:type="spellStart"/>
+      <w:r>
+        <w:rPr>
+          <w:spacing w:val="-2"/>
+        </w:rPr>
+        <w:t>auth</w:t>
+      </w:r>
+      <w:proofErr w:type="spellEnd"/>
+      <w:r>
+        <w:rPr>
+          <w:spacing w:val="-2"/>
+        </w:rPr>
+        <w:t>/register"];</w:t>
       </w:r>
     </w:p>
     <w:p>
@@ -7490,9 +7938,11 @@
           <w:rFonts w:ascii="Courier New" w:hAnsi="Courier New"/>
         </w:rPr>
       </w:pPr>
+      <w:proofErr w:type="spellStart"/>
       <w:r>
         <w:t>const</w:t>
       </w:r>
+      <w:proofErr w:type="spellEnd"/>
       <w:r>
         <w:rPr>
           <w:spacing w:val="-6"/>
@@ -7500,7 +7950,15 @@
         <w:t xml:space="preserve"> </w:t>
       </w:r>
       <w:r>
-        <w:t>{pathname}</w:t>
+        <w:t>{</w:t>
+      </w:r>
+      <w:proofErr w:type="spellStart"/>
+      <w:r>
+        <w:t>pathname</w:t>
+      </w:r>
+      <w:proofErr w:type="spellEnd"/>
+      <w:r>
+        <w:t>}</w:t>
       </w:r>
       <w:r>
         <w:rPr>
@@ -7517,11 +7975,19 @@
         </w:rPr>
         <w:t xml:space="preserve"> </w:t>
       </w:r>
-      <w:r>
-        <w:rPr>
-          <w:spacing w:val="-2"/>
-        </w:rPr>
-        <w:t>useRouter();</w:t>
+      <w:proofErr w:type="spellStart"/>
+      <w:r>
+        <w:rPr>
+          <w:spacing w:val="-2"/>
+        </w:rPr>
+        <w:t>useRouter</w:t>
+      </w:r>
+      <w:proofErr w:type="spellEnd"/>
+      <w:r>
+        <w:rPr>
+          <w:spacing w:val="-2"/>
+        </w:rPr>
+        <w:t>();</w:t>
       </w:r>
     </w:p>
     <w:p>
@@ -7544,7 +8010,35 @@
         <w:rPr>
           <w:spacing w:val="-2"/>
         </w:rPr>
-        <w:t>{!disableNavbar.includes(router.pathname)</w:t>
+        <w:t>{!</w:t>
+      </w:r>
+      <w:proofErr w:type="spellStart"/>
+      <w:r>
+        <w:rPr>
+          <w:spacing w:val="-2"/>
+        </w:rPr>
+        <w:t>disableNavbar.includes</w:t>
+      </w:r>
+      <w:proofErr w:type="spellEnd"/>
+      <w:r>
+        <w:rPr>
+          <w:spacing w:val="-2"/>
+        </w:rPr>
+        <w:t>(</w:t>
+      </w:r>
+      <w:proofErr w:type="spellStart"/>
+      <w:r>
+        <w:rPr>
+          <w:spacing w:val="-2"/>
+        </w:rPr>
+        <w:t>router.pathname</w:t>
+      </w:r>
+      <w:proofErr w:type="spellEnd"/>
+      <w:r>
+        <w:rPr>
+          <w:spacing w:val="-2"/>
+        </w:rPr>
+        <w:t>)</w:t>
       </w:r>
       <w:r>
         <w:rPr>
@@ -7568,8 +8062,16 @@
         <w:rPr>
           <w:spacing w:val="-2"/>
         </w:rPr>
-        <w:t>&lt;Navbar</w:t>
-      </w:r>
+        <w:t>&lt;</w:t>
+      </w:r>
+      <w:proofErr w:type="spellStart"/>
+      <w:r>
+        <w:rPr>
+          <w:spacing w:val="-2"/>
+        </w:rPr>
+        <w:t>Navbar</w:t>
+      </w:r>
+      <w:proofErr w:type="spellEnd"/>
       <w:r>
         <w:rPr>
           <w:spacing w:val="8"/>
@@ -7845,12 +8347,21 @@
         </w:rPr>
         <w:t xml:space="preserve"> </w:t>
       </w:r>
+      <w:proofErr w:type="spellStart"/>
       <w:r>
         <w:rPr>
           <w:spacing w:val="-2"/>
           <w:w w:val="120"/>
         </w:rPr>
-        <w:t>Insight:</w:t>
+        <w:t>Insight</w:t>
+      </w:r>
+      <w:proofErr w:type="spellEnd"/>
+      <w:r>
+        <w:rPr>
+          <w:spacing w:val="-2"/>
+          <w:w w:val="120"/>
+        </w:rPr>
+        <w:t>:</w:t>
       </w:r>
     </w:p>
     <w:p>
@@ -7878,9 +8389,11 @@
         </w:rPr>
         <w:t xml:space="preserve"> </w:t>
       </w:r>
+      <w:proofErr w:type="spellStart"/>
       <w:r>
         <w:t>router.pathname</w:t>
       </w:r>
+      <w:proofErr w:type="spellEnd"/>
       <w:r>
         <w:rPr>
           <w:spacing w:val="-10"/>
@@ -7905,9 +8418,11 @@
         </w:rPr>
         <w:t xml:space="preserve"> </w:t>
       </w:r>
+      <w:proofErr w:type="spellStart"/>
       <w:r>
         <w:t>query</w:t>
       </w:r>
+      <w:proofErr w:type="spellEnd"/>
       <w:r>
         <w:rPr>
           <w:spacing w:val="-10"/>
@@ -7937,9 +8452,11 @@
           <w:sz w:val="20"/>
         </w:rPr>
       </w:pPr>
+      <w:proofErr w:type="spellStart"/>
       <w:r>
         <w:t>const</w:t>
       </w:r>
+      <w:proofErr w:type="spellEnd"/>
       <w:r>
         <w:rPr>
           <w:spacing w:val="-6"/>
@@ -7947,7 +8464,15 @@
         <w:t xml:space="preserve"> </w:t>
       </w:r>
       <w:r>
-        <w:t>{pathname}</w:t>
+        <w:t>{</w:t>
+      </w:r>
+      <w:proofErr w:type="spellStart"/>
+      <w:r>
+        <w:t>pathname</w:t>
+      </w:r>
+      <w:proofErr w:type="spellEnd"/>
+      <w:r>
+        <w:t>}</w:t>
       </w:r>
       <w:r>
         <w:rPr>
@@ -7964,11 +8489,19 @@
         </w:rPr>
         <w:t xml:space="preserve"> </w:t>
       </w:r>
-      <w:r>
-        <w:rPr>
-          <w:spacing w:val="-2"/>
-        </w:rPr>
-        <w:t>useRouter();</w:t>
+      <w:proofErr w:type="spellStart"/>
+      <w:r>
+        <w:rPr>
+          <w:spacing w:val="-2"/>
+        </w:rPr>
+        <w:t>useRouter</w:t>
+      </w:r>
+      <w:proofErr w:type="spellEnd"/>
+      <w:r>
+        <w:rPr>
+          <w:spacing w:val="-2"/>
+        </w:rPr>
+        <w:t>();</w:t>
       </w:r>
     </w:p>
     <w:p>
@@ -8038,27 +8571,33 @@
           </wp:anchor>
         </w:drawing>
       </w:r>
+      <w:proofErr w:type="spellStart"/>
       <w:r>
         <w:t>Darimana</w:t>
       </w:r>
+      <w:proofErr w:type="spellEnd"/>
       <w:r>
         <w:rPr>
           <w:spacing w:val="-5"/>
         </w:rPr>
         <w:t xml:space="preserve"> </w:t>
       </w:r>
+      <w:proofErr w:type="spellStart"/>
       <w:r>
         <w:t>kah</w:t>
       </w:r>
+      <w:proofErr w:type="spellEnd"/>
       <w:r>
         <w:rPr>
           <w:spacing w:val="-4"/>
         </w:rPr>
         <w:t xml:space="preserve"> </w:t>
       </w:r>
+      <w:proofErr w:type="spellStart"/>
       <w:r>
         <w:t>pathname</w:t>
       </w:r>
+      <w:proofErr w:type="spellEnd"/>
       <w:r>
         <w:rPr>
           <w:spacing w:val="-3"/>
@@ -8101,12 +8640,14 @@
         </w:rPr>
         <w:t xml:space="preserve"> </w:t>
       </w:r>
+      <w:proofErr w:type="spellStart"/>
       <w:r>
         <w:rPr>
           <w:spacing w:val="-2"/>
         </w:rPr>
         <w:t>router</w:t>
       </w:r>
+      <w:proofErr w:type="spellEnd"/>
     </w:p>
     <w:p>
       <w:pPr>
@@ -8142,9 +8683,11 @@
         </w:rPr>
         <w:t xml:space="preserve"> </w:t>
       </w:r>
+      <w:proofErr w:type="spellStart"/>
       <w:r>
         <w:t>asPath</w:t>
       </w:r>
+      <w:proofErr w:type="spellEnd"/>
       <w:r>
         <w:rPr>
           <w:spacing w:val="-6"/>
@@ -8169,9 +8712,11 @@
         </w:rPr>
         <w:t xml:space="preserve"> </w:t>
       </w:r>
+      <w:proofErr w:type="spellStart"/>
       <w:r>
         <w:t>query</w:t>
       </w:r>
+      <w:proofErr w:type="spellEnd"/>
       <w:r>
         <w:rPr>
           <w:spacing w:val="-5"/>
@@ -8551,7 +9096,7 @@
           </mc:Choice>
           <mc:Fallback>
             <w:pict>
-              <v:group w14:anchorId="138C2C34" id="Group 71" o:spid="_x0000_s1026" style="position:absolute;margin-left:1in;margin-top:18.45pt;width:451.4pt;height:1.55pt;z-index:-15718912;mso-wrap-distance-left:0;mso-wrap-distance-right:0;mso-position-horizontal-relative:page" coordsize="57327,196" o:gfxdata="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">
+              <v:group w14:anchorId="35F0AAF9" id="Group 71" o:spid="_x0000_s1026" style="position:absolute;margin-left:1in;margin-top:18.45pt;width:451.4pt;height:1.55pt;z-index:-15718912;mso-wrap-distance-left:0;mso-wrap-distance-right:0;mso-position-horizontal-relative:page" coordsize="57327,196" o:gfxdata="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">
                 <v:shape id="Graphic 72" o:spid="_x0000_s1027" style="position:absolute;width:57315;height:190;visibility:visible;mso-wrap-style:square;v-text-anchor:top" coordsize="5731510,19050" o:gfxdata="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" path="m5731497,l,,,381,,2921,,19050r5731497,l5731497,xe" fillcolor="#9f9f9f" stroked="f">
                   <v:path arrowok="t"/>
                 </v:shape>
@@ -8593,12 +9138,14 @@
           <w:b/>
         </w:rPr>
       </w:pPr>
+      <w:proofErr w:type="spellStart"/>
       <w:r>
         <w:rPr>
           <w:b/>
         </w:rPr>
         <w:t>Refactoring</w:t>
       </w:r>
+      <w:proofErr w:type="spellEnd"/>
       <w:r>
         <w:rPr>
           <w:b/>
@@ -8645,12 +9192,21 @@
         </w:rPr>
         <w:t xml:space="preserve"> </w:t>
       </w:r>
-      <w:r>
-        <w:rPr>
-          <w:b/>
-          <w:spacing w:val="-2"/>
-        </w:rPr>
-        <w:t>Practice)</w:t>
+      <w:proofErr w:type="spellStart"/>
+      <w:r>
+        <w:rPr>
+          <w:b/>
+          <w:spacing w:val="-2"/>
+        </w:rPr>
+        <w:t>Practice</w:t>
+      </w:r>
+      <w:proofErr w:type="spellEnd"/>
+      <w:r>
+        <w:rPr>
+          <w:b/>
+          <w:spacing w:val="-2"/>
+        </w:rPr>
+        <w:t>)</w:t>
       </w:r>
     </w:p>
     <w:p>
@@ -8720,23 +9276,47 @@
         <w:pStyle w:val="TeksIsi"/>
         <w:spacing w:before="182"/>
       </w:pPr>
-      <w:r>
-        <w:rPr>
-          <w:spacing w:val="-2"/>
-        </w:rPr>
-        <w:t>pages/login.tsx</w:t>
-      </w:r>
+      <w:proofErr w:type="spellStart"/>
+      <w:r>
+        <w:rPr>
+          <w:spacing w:val="-2"/>
+        </w:rPr>
+        <w:t>pages</w:t>
+      </w:r>
+      <w:proofErr w:type="spellEnd"/>
+      <w:r>
+        <w:rPr>
+          <w:spacing w:val="-2"/>
+        </w:rPr>
+        <w:t>/</w:t>
+      </w:r>
+      <w:proofErr w:type="spellStart"/>
+      <w:r>
+        <w:rPr>
+          <w:spacing w:val="-2"/>
+        </w:rPr>
+        <w:t>login.tsx</w:t>
+      </w:r>
+      <w:proofErr w:type="spellEnd"/>
     </w:p>
     <w:p>
       <w:pPr>
         <w:pStyle w:val="TeksIsi"/>
         <w:spacing w:before="181"/>
       </w:pPr>
-      <w:r>
-        <w:rPr>
-          <w:spacing w:val="-2"/>
-        </w:rPr>
-        <w:t>styles/login.module.css</w:t>
+      <w:proofErr w:type="spellStart"/>
+      <w:r>
+        <w:rPr>
+          <w:spacing w:val="-2"/>
+        </w:rPr>
+        <w:t>styles</w:t>
+      </w:r>
+      <w:proofErr w:type="spellEnd"/>
+      <w:r>
+        <w:rPr>
+          <w:spacing w:val="-2"/>
+        </w:rPr>
+        <w:t>/login.module.css</w:t>
       </w:r>
     </w:p>
     <w:p>
@@ -8827,12 +9407,14 @@
         </w:rPr>
         <w:t xml:space="preserve"> </w:t>
       </w:r>
+      <w:proofErr w:type="spellStart"/>
       <w:r>
         <w:rPr>
           <w:b/>
         </w:rPr>
         <w:t>Refactor</w:t>
       </w:r>
+      <w:proofErr w:type="spellEnd"/>
       <w:r>
         <w:rPr>
           <w:b/>
@@ -8853,23 +9435,103 @@
         <w:pStyle w:val="TeksIsi"/>
         <w:spacing w:before="181"/>
       </w:pPr>
-      <w:r>
-        <w:rPr>
-          <w:spacing w:val="-2"/>
-        </w:rPr>
-        <w:t>pages/auth/login.tsx</w:t>
-      </w:r>
+      <w:proofErr w:type="spellStart"/>
+      <w:r>
+        <w:rPr>
+          <w:spacing w:val="-2"/>
+        </w:rPr>
+        <w:t>pages</w:t>
+      </w:r>
+      <w:proofErr w:type="spellEnd"/>
+      <w:r>
+        <w:rPr>
+          <w:spacing w:val="-2"/>
+        </w:rPr>
+        <w:t>/</w:t>
+      </w:r>
+      <w:proofErr w:type="spellStart"/>
+      <w:r>
+        <w:rPr>
+          <w:spacing w:val="-2"/>
+        </w:rPr>
+        <w:t>auth</w:t>
+      </w:r>
+      <w:proofErr w:type="spellEnd"/>
+      <w:r>
+        <w:rPr>
+          <w:spacing w:val="-2"/>
+        </w:rPr>
+        <w:t>/</w:t>
+      </w:r>
+      <w:proofErr w:type="spellStart"/>
+      <w:r>
+        <w:rPr>
+          <w:spacing w:val="-2"/>
+        </w:rPr>
+        <w:t>login.tsx</w:t>
+      </w:r>
+      <w:proofErr w:type="spellEnd"/>
     </w:p>
     <w:p>
       <w:pPr>
         <w:pStyle w:val="TeksIsi"/>
         <w:spacing w:before="182"/>
       </w:pPr>
-      <w:r>
-        <w:rPr>
-          <w:spacing w:val="-2"/>
-        </w:rPr>
-        <w:t>src/views/auth/Login/</w:t>
+      <w:proofErr w:type="spellStart"/>
+      <w:r>
+        <w:rPr>
+          <w:spacing w:val="-2"/>
+        </w:rPr>
+        <w:t>src</w:t>
+      </w:r>
+      <w:proofErr w:type="spellEnd"/>
+      <w:r>
+        <w:rPr>
+          <w:spacing w:val="-2"/>
+        </w:rPr>
+        <w:t>/</w:t>
+      </w:r>
+      <w:proofErr w:type="spellStart"/>
+      <w:r>
+        <w:rPr>
+          <w:spacing w:val="-2"/>
+        </w:rPr>
+        <w:t>views</w:t>
+      </w:r>
+      <w:proofErr w:type="spellEnd"/>
+      <w:r>
+        <w:rPr>
+          <w:spacing w:val="-2"/>
+        </w:rPr>
+        <w:t>/</w:t>
+      </w:r>
+      <w:proofErr w:type="spellStart"/>
+      <w:r>
+        <w:rPr>
+          <w:spacing w:val="-2"/>
+        </w:rPr>
+        <w:t>auth</w:t>
+      </w:r>
+      <w:proofErr w:type="spellEnd"/>
+      <w:r>
+        <w:rPr>
+          <w:spacing w:val="-2"/>
+        </w:rPr>
+        <w:t>/</w:t>
+      </w:r>
+      <w:proofErr w:type="spellStart"/>
+      <w:r>
+        <w:rPr>
+          <w:spacing w:val="-2"/>
+        </w:rPr>
+        <w:t>Login</w:t>
+      </w:r>
+      <w:proofErr w:type="spellEnd"/>
+      <w:r>
+        <w:rPr>
+          <w:spacing w:val="-2"/>
+        </w:rPr>
+        <w:t>/</w:t>
       </w:r>
     </w:p>
     <w:p>
@@ -8887,12 +9549,14 @@
       <w:r>
         <w:t xml:space="preserve">── </w:t>
       </w:r>
+      <w:proofErr w:type="spellStart"/>
       <w:r>
         <w:rPr>
           <w:spacing w:val="-2"/>
         </w:rPr>
         <w:t>index.tsx</w:t>
       </w:r>
+      <w:proofErr w:type="spellEnd"/>
     </w:p>
     <w:p>
       <w:pPr>
@@ -9026,11 +9690,47 @@
         </w:rPr>
         <w:t xml:space="preserve"> </w:t>
       </w:r>
-      <w:r>
-        <w:rPr>
-          <w:spacing w:val="-2"/>
-        </w:rPr>
-        <w:t>view/auth/login/</w:t>
+      <w:proofErr w:type="spellStart"/>
+      <w:r>
+        <w:rPr>
+          <w:spacing w:val="-2"/>
+        </w:rPr>
+        <w:t>view</w:t>
+      </w:r>
+      <w:proofErr w:type="spellEnd"/>
+      <w:r>
+        <w:rPr>
+          <w:spacing w:val="-2"/>
+        </w:rPr>
+        <w:t>/</w:t>
+      </w:r>
+      <w:proofErr w:type="spellStart"/>
+      <w:r>
+        <w:rPr>
+          <w:spacing w:val="-2"/>
+        </w:rPr>
+        <w:t>auth</w:t>
+      </w:r>
+      <w:proofErr w:type="spellEnd"/>
+      <w:r>
+        <w:rPr>
+          <w:spacing w:val="-2"/>
+        </w:rPr>
+        <w:t>/</w:t>
+      </w:r>
+      <w:proofErr w:type="spellStart"/>
+      <w:r>
+        <w:rPr>
+          <w:spacing w:val="-2"/>
+        </w:rPr>
+        <w:t>login</w:t>
+      </w:r>
+      <w:proofErr w:type="spellEnd"/>
+      <w:r>
+        <w:rPr>
+          <w:spacing w:val="-2"/>
+        </w:rPr>
+        <w:t>/</w:t>
       </w:r>
     </w:p>
     <w:p>
@@ -9139,9 +9839,19 @@
         </w:rPr>
         <w:t xml:space="preserve"> </w:t>
       </w:r>
-      <w:r>
-        <w:t>pages/auth</w:t>
-      </w:r>
+      <w:proofErr w:type="spellStart"/>
+      <w:r>
+        <w:t>pages</w:t>
+      </w:r>
+      <w:proofErr w:type="spellEnd"/>
+      <w:r>
+        <w:t>/</w:t>
+      </w:r>
+      <w:proofErr w:type="spellStart"/>
+      <w:r>
+        <w:t>auth</w:t>
+      </w:r>
+      <w:proofErr w:type="spellEnd"/>
       <w:r>
         <w:rPr>
           <w:spacing w:val="-5"/>
@@ -9314,9 +10024,11 @@
         </w:rPr>
         <w:t xml:space="preserve"> </w:t>
       </w:r>
+      <w:proofErr w:type="spellStart"/>
       <w:r>
         <w:t>login.tsx</w:t>
       </w:r>
+      <w:proofErr w:type="spellEnd"/>
       <w:r>
         <w:rPr>
           <w:spacing w:val="-7"/>
@@ -9341,12 +10053,28 @@
         </w:rPr>
         <w:t xml:space="preserve"> </w:t>
       </w:r>
-      <w:r>
-        <w:rPr>
-          <w:spacing w:val="-2"/>
-        </w:rPr>
-        <w:t>pages/auth</w:t>
-      </w:r>
+      <w:proofErr w:type="spellStart"/>
+      <w:r>
+        <w:rPr>
+          <w:spacing w:val="-2"/>
+        </w:rPr>
+        <w:t>pages</w:t>
+      </w:r>
+      <w:proofErr w:type="spellEnd"/>
+      <w:r>
+        <w:rPr>
+          <w:spacing w:val="-2"/>
+        </w:rPr>
+        <w:t>/</w:t>
+      </w:r>
+      <w:proofErr w:type="spellStart"/>
+      <w:r>
+        <w:rPr>
+          <w:spacing w:val="-2"/>
+        </w:rPr>
+        <w:t>auth</w:t>
+      </w:r>
+      <w:proofErr w:type="spellEnd"/>
     </w:p>
     <w:tbl>
       <w:tblPr>
@@ -9564,9 +10292,11 @@
         </w:rPr>
         <w:t xml:space="preserve"> </w:t>
       </w:r>
+      <w:proofErr w:type="spellStart"/>
       <w:r>
         <w:t>index.tsx</w:t>
       </w:r>
+      <w:proofErr w:type="spellEnd"/>
       <w:r>
         <w:rPr>
           <w:spacing w:val="-8"/>
@@ -9591,12 +10321,42 @@
         </w:rPr>
         <w:t xml:space="preserve"> </w:t>
       </w:r>
-      <w:r>
-        <w:rPr>
-          <w:spacing w:val="-2"/>
-        </w:rPr>
-        <w:t>views/auth/login</w:t>
-      </w:r>
+      <w:proofErr w:type="spellStart"/>
+      <w:r>
+        <w:rPr>
+          <w:spacing w:val="-2"/>
+        </w:rPr>
+        <w:t>views</w:t>
+      </w:r>
+      <w:proofErr w:type="spellEnd"/>
+      <w:r>
+        <w:rPr>
+          <w:spacing w:val="-2"/>
+        </w:rPr>
+        <w:t>/</w:t>
+      </w:r>
+      <w:proofErr w:type="spellStart"/>
+      <w:r>
+        <w:rPr>
+          <w:spacing w:val="-2"/>
+        </w:rPr>
+        <w:t>auth</w:t>
+      </w:r>
+      <w:proofErr w:type="spellEnd"/>
+      <w:r>
+        <w:rPr>
+          <w:spacing w:val="-2"/>
+        </w:rPr>
+        <w:t>/</w:t>
+      </w:r>
+      <w:proofErr w:type="spellStart"/>
+      <w:r>
+        <w:rPr>
+          <w:spacing w:val="-2"/>
+        </w:rPr>
+        <w:t>login</w:t>
+      </w:r>
+      <w:proofErr w:type="spellEnd"/>
     </w:p>
     <w:p>
       <w:pPr>
@@ -9693,6 +10453,7 @@
       </w:r>
       <w:r>
         <w:rPr>
+          <w:noProof/>
           <w:sz w:val="20"/>
         </w:rPr>
         <w:drawing>
@@ -9806,9 +10567,11 @@
           <w:sz w:val="20"/>
         </w:rPr>
       </w:pPr>
+      <w:proofErr w:type="spellStart"/>
       <w:r>
         <w:t>Routing</w:t>
       </w:r>
+      <w:proofErr w:type="spellEnd"/>
       <w:r>
         <w:rPr>
           <w:spacing w:val="-10"/>
@@ -9846,9 +10609,11 @@
           <w:sz w:val="20"/>
         </w:rPr>
       </w:pPr>
+      <w:proofErr w:type="spellStart"/>
       <w:r>
         <w:t>Logic</w:t>
       </w:r>
+      <w:proofErr w:type="spellEnd"/>
       <w:r>
         <w:rPr>
           <w:spacing w:val="-2"/>
@@ -10271,7 +11036,7 @@
           </mc:Choice>
           <mc:Fallback>
             <w:pict>
-              <v:group w14:anchorId="04B12730" id="Group 87" o:spid="_x0000_s1026" style="position:absolute;margin-left:1in;margin-top:18.4pt;width:451.4pt;height:1.55pt;z-index:-15716864;mso-wrap-distance-left:0;mso-wrap-distance-right:0;mso-position-horizontal-relative:page" coordsize="57327,196" o:gfxdata="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">
+              <v:group w14:anchorId="68745C30" id="Group 87" o:spid="_x0000_s1026" style="position:absolute;margin-left:1in;margin-top:18.4pt;width:451.4pt;height:1.55pt;z-index:-15716864;mso-wrap-distance-left:0;mso-wrap-distance-right:0;mso-position-horizontal-relative:page" coordsize="57327,196" o:gfxdata="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">
                 <v:shape id="Graphic 88" o:spid="_x0000_s1027" style="position:absolute;width:57315;height:190;visibility:visible;mso-wrap-style:square;v-text-anchor:top" coordsize="5731510,19050" o:gfxdata="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" path="m5731497,l,,,647,,3175,,19050r5731497,l5731497,xe" fillcolor="#9f9f9f" stroked="f">
                   <v:path arrowok="t"/>
                 </v:shape>
@@ -10313,12 +11078,14 @@
           <w:b/>
         </w:rPr>
       </w:pPr>
+      <w:proofErr w:type="spellStart"/>
       <w:r>
         <w:rPr>
           <w:b/>
         </w:rPr>
         <w:t>Inline</w:t>
       </w:r>
+      <w:proofErr w:type="spellEnd"/>
       <w:r>
         <w:rPr>
           <w:b/>
@@ -10326,12 +11093,14 @@
         </w:rPr>
         <w:t xml:space="preserve"> </w:t>
       </w:r>
+      <w:proofErr w:type="spellStart"/>
       <w:r>
         <w:rPr>
           <w:b/>
         </w:rPr>
         <w:t>Styling</w:t>
       </w:r>
+      <w:proofErr w:type="spellEnd"/>
       <w:r>
         <w:rPr>
           <w:b/>
@@ -10376,9 +11145,11 @@
         </w:rPr>
         <w:t xml:space="preserve"> </w:t>
       </w:r>
+      <w:proofErr w:type="spellStart"/>
       <w:r>
         <w:t>index.tsx</w:t>
       </w:r>
+      <w:proofErr w:type="spellEnd"/>
       <w:r>
         <w:rPr>
           <w:spacing w:val="-8"/>
@@ -10403,12 +11174,42 @@
         </w:rPr>
         <w:t xml:space="preserve"> </w:t>
       </w:r>
-      <w:r>
-        <w:rPr>
-          <w:spacing w:val="-2"/>
-        </w:rPr>
-        <w:t>views/auth/login</w:t>
-      </w:r>
+      <w:proofErr w:type="spellStart"/>
+      <w:r>
+        <w:rPr>
+          <w:spacing w:val="-2"/>
+        </w:rPr>
+        <w:t>views</w:t>
+      </w:r>
+      <w:proofErr w:type="spellEnd"/>
+      <w:r>
+        <w:rPr>
+          <w:spacing w:val="-2"/>
+        </w:rPr>
+        <w:t>/</w:t>
+      </w:r>
+      <w:proofErr w:type="spellStart"/>
+      <w:r>
+        <w:rPr>
+          <w:spacing w:val="-2"/>
+        </w:rPr>
+        <w:t>auth</w:t>
+      </w:r>
+      <w:proofErr w:type="spellEnd"/>
+      <w:r>
+        <w:rPr>
+          <w:spacing w:val="-2"/>
+        </w:rPr>
+        <w:t>/</w:t>
+      </w:r>
+      <w:proofErr w:type="spellStart"/>
+      <w:r>
+        <w:rPr>
+          <w:spacing w:val="-2"/>
+        </w:rPr>
+        <w:t>login</w:t>
+      </w:r>
+      <w:proofErr w:type="spellEnd"/>
     </w:p>
     <w:p>
       <w:pPr>
@@ -10484,8 +11285,13 @@
         </w:rPr>
         <w:t xml:space="preserve"> </w:t>
       </w:r>
-      <w:r>
-        <w:t>style={{</w:t>
+      <w:proofErr w:type="spellStart"/>
+      <w:r>
+        <w:t>style</w:t>
+      </w:r>
+      <w:proofErr w:type="spellEnd"/>
+      <w:r>
+        <w:t>={{</w:t>
       </w:r>
       <w:r>
         <w:rPr>
@@ -10493,8 +11299,13 @@
         </w:rPr>
         <w:t xml:space="preserve"> </w:t>
       </w:r>
-      <w:r>
-        <w:t>color:</w:t>
+      <w:proofErr w:type="spellStart"/>
+      <w:r>
+        <w:t>color</w:t>
+      </w:r>
+      <w:proofErr w:type="spellEnd"/>
+      <w:r>
+        <w:t>:</w:t>
       </w:r>
       <w:r>
         <w:rPr>
@@ -10503,7 +11314,23 @@
         <w:t xml:space="preserve"> </w:t>
       </w:r>
       <w:r>
-        <w:t>"red",borderRadius:</w:t>
+        <w:t>"</w:t>
+      </w:r>
+      <w:proofErr w:type="spellStart"/>
+      <w:r>
+        <w:t>red</w:t>
+      </w:r>
+      <w:proofErr w:type="spellEnd"/>
+      <w:r>
+        <w:t>",</w:t>
+      </w:r>
+      <w:proofErr w:type="spellStart"/>
+      <w:r>
+        <w:t>borderRadius</w:t>
+      </w:r>
+      <w:proofErr w:type="spellEnd"/>
+      <w:r>
+        <w:t>:</w:t>
       </w:r>
       <w:r>
         <w:rPr>
@@ -10608,6 +11435,7 @@
       </w:r>
       <w:r>
         <w:rPr>
+          <w:noProof/>
           <w:sz w:val="20"/>
         </w:rPr>
         <w:drawing>
@@ -10758,12 +11586,14 @@
         </w:rPr>
         <w:t xml:space="preserve"> </w:t>
       </w:r>
+      <w:proofErr w:type="spellStart"/>
       <w:r>
         <w:rPr>
           <w:spacing w:val="-2"/>
         </w:rPr>
         <w:t>camelCase</w:t>
       </w:r>
+      <w:proofErr w:type="spellEnd"/>
     </w:p>
     <w:p>
       <w:pPr>
@@ -10781,8 +11611,13 @@
           <w:sz w:val="20"/>
         </w:rPr>
       </w:pPr>
-      <w:r>
-        <w:t>borderRadius:</w:t>
+      <w:proofErr w:type="spellStart"/>
+      <w:r>
+        <w:t>borderRadius</w:t>
+      </w:r>
+      <w:proofErr w:type="spellEnd"/>
+      <w:r>
+        <w:t>:</w:t>
       </w:r>
       <w:r>
         <w:rPr>
@@ -10831,9 +11666,11 @@
         </w:rPr>
         <w:t xml:space="preserve"> </w:t>
       </w:r>
+      <w:proofErr w:type="spellStart"/>
       <w:r>
         <w:t>styling</w:t>
       </w:r>
+      <w:proofErr w:type="spellEnd"/>
       <w:r>
         <w:rPr>
           <w:spacing w:val="-3"/>
@@ -10907,9 +11744,11 @@
         </w:rPr>
         <w:t xml:space="preserve"> </w:t>
       </w:r>
+      <w:proofErr w:type="spellStart"/>
       <w:r>
         <w:t>layout</w:t>
       </w:r>
+      <w:proofErr w:type="spellEnd"/>
       <w:r>
         <w:rPr>
           <w:spacing w:val="-6"/>
@@ -11289,7 +12128,7 @@
           </mc:Choice>
           <mc:Fallback>
             <w:pict>
-              <v:group w14:anchorId="24F6FADA" id="Group 96" o:spid="_x0000_s1026" style="position:absolute;margin-left:1in;margin-top:18.3pt;width:451.4pt;height:1.55pt;z-index:-15715840;mso-wrap-distance-left:0;mso-wrap-distance-right:0;mso-position-horizontal-relative:page" coordsize="57327,196" o:gfxdata="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">
+              <v:group w14:anchorId="3A462916" id="Group 96" o:spid="_x0000_s1026" style="position:absolute;margin-left:1in;margin-top:18.3pt;width:451.4pt;height:1.55pt;z-index:-15715840;mso-wrap-distance-left:0;mso-wrap-distance-right:0;mso-position-horizontal-relative:page" coordsize="57327,196" o:gfxdata="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">
                 <v:shape id="Graphic 97" o:spid="_x0000_s1027" style="position:absolute;width:57315;height:190;visibility:visible;mso-wrap-style:square;v-text-anchor:top" coordsize="5731510,19050" o:gfxdata="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" path="m5731497,l,,,254,,2794,,19050r5731497,l5731497,xe" fillcolor="#9f9f9f" stroked="f">
                   <v:path arrowok="t"/>
                 </v:shape>
@@ -11396,6 +12235,7 @@
         </w:rPr>
         <w:t xml:space="preserve"> </w:t>
       </w:r>
+      <w:proofErr w:type="spellStart"/>
       <w:r>
         <w:rPr>
           <w:b/>
@@ -11403,6 +12243,7 @@
         </w:rPr>
         <w:t>Module</w:t>
       </w:r>
+      <w:proofErr w:type="spellEnd"/>
     </w:p>
     <w:p>
       <w:pPr>
@@ -11517,9 +12358,11 @@
         </w:rPr>
         <w:t xml:space="preserve"> </w:t>
       </w:r>
+      <w:proofErr w:type="spellStart"/>
       <w:r>
         <w:t>index.tsx</w:t>
       </w:r>
+      <w:proofErr w:type="spellEnd"/>
       <w:r>
         <w:rPr>
           <w:spacing w:val="-7"/>
@@ -11544,12 +12387,42 @@
         </w:rPr>
         <w:t xml:space="preserve"> </w:t>
       </w:r>
-      <w:r>
-        <w:rPr>
-          <w:spacing w:val="-2"/>
-        </w:rPr>
-        <w:t>components/layouts/navbar</w:t>
-      </w:r>
+      <w:proofErr w:type="spellStart"/>
+      <w:r>
+        <w:rPr>
+          <w:spacing w:val="-2"/>
+        </w:rPr>
+        <w:t>components</w:t>
+      </w:r>
+      <w:proofErr w:type="spellEnd"/>
+      <w:r>
+        <w:rPr>
+          <w:spacing w:val="-2"/>
+        </w:rPr>
+        <w:t>/</w:t>
+      </w:r>
+      <w:proofErr w:type="spellStart"/>
+      <w:r>
+        <w:rPr>
+          <w:spacing w:val="-2"/>
+        </w:rPr>
+        <w:t>layouts</w:t>
+      </w:r>
+      <w:proofErr w:type="spellEnd"/>
+      <w:r>
+        <w:rPr>
+          <w:spacing w:val="-2"/>
+        </w:rPr>
+        <w:t>/</w:t>
+      </w:r>
+      <w:proofErr w:type="spellStart"/>
+      <w:r>
+        <w:rPr>
+          <w:spacing w:val="-2"/>
+        </w:rPr>
+        <w:t>navbar</w:t>
+      </w:r>
+      <w:proofErr w:type="spellEnd"/>
     </w:p>
     <w:p>
       <w:pPr>
@@ -11615,11 +12488,47 @@
       <w:r>
         <w:t xml:space="preserve">&lt;div </w:t>
       </w:r>
-      <w:r>
-        <w:rPr>
-          <w:spacing w:val="-2"/>
-        </w:rPr>
-        <w:t>className=”big”&gt;navbar&lt;/div&gt;</w:t>
+      <w:proofErr w:type="spellStart"/>
+      <w:r>
+        <w:rPr>
+          <w:spacing w:val="-2"/>
+        </w:rPr>
+        <w:t>className</w:t>
+      </w:r>
+      <w:proofErr w:type="spellEnd"/>
+      <w:r>
+        <w:rPr>
+          <w:spacing w:val="-2"/>
+        </w:rPr>
+        <w:t>=”</w:t>
+      </w:r>
+      <w:proofErr w:type="spellStart"/>
+      <w:r>
+        <w:rPr>
+          <w:spacing w:val="-2"/>
+        </w:rPr>
+        <w:t>big</w:t>
+      </w:r>
+      <w:proofErr w:type="spellEnd"/>
+      <w:r>
+        <w:rPr>
+          <w:spacing w:val="-2"/>
+        </w:rPr>
+        <w:t>”&gt;</w:t>
+      </w:r>
+      <w:proofErr w:type="spellStart"/>
+      <w:r>
+        <w:rPr>
+          <w:spacing w:val="-2"/>
+        </w:rPr>
+        <w:t>navbar</w:t>
+      </w:r>
+      <w:proofErr w:type="spellEnd"/>
+      <w:r>
+        <w:rPr>
+          <w:spacing w:val="-2"/>
+        </w:rPr>
+        <w:t>&lt;/div&gt;</w:t>
       </w:r>
     </w:p>
     <w:p>
@@ -11714,9 +12623,11 @@
         </w:rPr>
         <w:t xml:space="preserve"> </w:t>
       </w:r>
+      <w:proofErr w:type="spellStart"/>
       <w:r>
         <w:t>utility</w:t>
       </w:r>
+      <w:proofErr w:type="spellEnd"/>
       <w:r>
         <w:rPr>
           <w:spacing w:val="-1"/>
@@ -11760,10 +12671,12 @@
           <w:sz w:val="20"/>
         </w:rPr>
       </w:pPr>
+      <w:proofErr w:type="spellStart"/>
       <w:r>
         <w:lastRenderedPageBreak/>
         <w:t>Module</w:t>
       </w:r>
+      <w:proofErr w:type="spellEnd"/>
       <w:r>
         <w:rPr>
           <w:spacing w:val="-5"/>
@@ -11779,9 +12692,11 @@
         </w:rPr>
         <w:t xml:space="preserve"> </w:t>
       </w:r>
+      <w:proofErr w:type="spellStart"/>
       <w:r>
         <w:t>styling</w:t>
       </w:r>
+      <w:proofErr w:type="spellEnd"/>
       <w:r>
         <w:rPr>
           <w:spacing w:val="-4"/>
@@ -12173,7 +13088,7 @@
           </mc:Choice>
           <mc:Fallback>
             <w:pict>
-              <v:group w14:anchorId="7459E1D0" id="Group 105" o:spid="_x0000_s1026" style="position:absolute;margin-left:1in;margin-top:18.45pt;width:451.4pt;height:1.5pt;z-index:-15714304;mso-wrap-distance-left:0;mso-wrap-distance-right:0;mso-position-horizontal-relative:page" coordsize="57327,190" o:gfxdata="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">
+              <v:group w14:anchorId="428E2066" id="Group 105" o:spid="_x0000_s1026" style="position:absolute;margin-left:1in;margin-top:18.45pt;width:451.4pt;height:1.5pt;z-index:-15714304;mso-wrap-distance-left:0;mso-wrap-distance-right:0;mso-position-horizontal-relative:page" coordsize="57327,190" o:gfxdata="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">
                 <v:shape id="Graphic 106" o:spid="_x0000_s1027" style="position:absolute;width:57315;height:190;visibility:visible;mso-wrap-style:square;v-text-anchor:top" coordsize="5731510,19050" o:gfxdata="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" path="m5731497,r-1638,l2540,,,,,2540,,19050r5731497,l5731497,xe" fillcolor="#9f9f9f" stroked="f">
                   <v:path arrowok="t"/>
                 </v:shape>
@@ -12245,12 +13160,14 @@
           <w:b/>
         </w:rPr>
       </w:pPr>
+      <w:proofErr w:type="spellStart"/>
       <w:r>
         <w:rPr>
           <w:b/>
         </w:rPr>
         <w:t>Install</w:t>
       </w:r>
+      <w:proofErr w:type="spellEnd"/>
       <w:r>
         <w:rPr>
           <w:b/>
@@ -12544,8 +13461,17 @@
           <w:b/>
           <w:spacing w:val="-2"/>
         </w:rPr>
-        <w:t xml:space="preserve"> Variable</w:t>
-      </w:r>
+        <w:t xml:space="preserve"> </w:t>
+      </w:r>
+      <w:proofErr w:type="spellStart"/>
+      <w:r>
+        <w:rPr>
+          <w:b/>
+          <w:spacing w:val="-2"/>
+        </w:rPr>
+        <w:t>Variable</w:t>
+      </w:r>
+      <w:proofErr w:type="spellEnd"/>
     </w:p>
     <w:p>
       <w:pPr>
@@ -12619,9 +13545,11 @@
         </w:rPr>
         <w:t xml:space="preserve"> </w:t>
       </w:r>
+      <w:proofErr w:type="spellStart"/>
       <w:r>
         <w:t>colors.scss</w:t>
       </w:r>
+      <w:proofErr w:type="spellEnd"/>
       <w:r>
         <w:rPr>
           <w:spacing w:val="-13"/>
@@ -12646,12 +13574,14 @@
         </w:rPr>
         <w:t xml:space="preserve"> </w:t>
       </w:r>
+      <w:proofErr w:type="spellStart"/>
       <w:r>
         <w:rPr>
           <w:spacing w:val="-2"/>
         </w:rPr>
         <w:t>styles</w:t>
       </w:r>
+      <w:proofErr w:type="spellEnd"/>
     </w:p>
     <w:p>
       <w:pPr>
@@ -12680,12 +13610,14 @@
         </w:rPr>
         <w:t xml:space="preserve"> </w:t>
       </w:r>
+      <w:proofErr w:type="spellStart"/>
       <w:r>
         <w:rPr>
           <w:spacing w:val="-2"/>
         </w:rPr>
         <w:t>colors.scss</w:t>
       </w:r>
+      <w:proofErr w:type="spellEnd"/>
     </w:p>
     <w:p>
       <w:pPr>
@@ -12790,8 +13722,17 @@
           <w:b/>
           <w:spacing w:val="-2"/>
         </w:rPr>
-        <w:t xml:space="preserve"> Module</w:t>
-      </w:r>
+        <w:t xml:space="preserve"> </w:t>
+      </w:r>
+      <w:proofErr w:type="spellStart"/>
+      <w:r>
+        <w:rPr>
+          <w:b/>
+          <w:spacing w:val="-2"/>
+        </w:rPr>
+        <w:t>Module</w:t>
+      </w:r>
+      <w:proofErr w:type="spellEnd"/>
     </w:p>
     <w:p>
       <w:pPr>
@@ -12866,18 +13807,22 @@
         </w:rPr>
         <w:t xml:space="preserve"> </w:t>
       </w:r>
+      <w:proofErr w:type="spellStart"/>
       <w:r>
         <w:t>file</w:t>
       </w:r>
+      <w:proofErr w:type="spellEnd"/>
       <w:r>
         <w:rPr>
           <w:spacing w:val="-9"/>
         </w:rPr>
         <w:t xml:space="preserve"> </w:t>
       </w:r>
+      <w:proofErr w:type="spellStart"/>
       <w:r>
         <w:t>login.module.scss</w:t>
       </w:r>
+      <w:proofErr w:type="spellEnd"/>
       <w:r>
         <w:rPr>
           <w:spacing w:val="-10"/>
@@ -12902,11 +13847,47 @@
         </w:rPr>
         <w:t xml:space="preserve"> </w:t>
       </w:r>
-      <w:r>
-        <w:rPr>
-          <w:spacing w:val="-2"/>
-        </w:rPr>
-        <w:t>views/auth/login/</w:t>
+      <w:proofErr w:type="spellStart"/>
+      <w:r>
+        <w:rPr>
+          <w:spacing w:val="-2"/>
+        </w:rPr>
+        <w:t>views</w:t>
+      </w:r>
+      <w:proofErr w:type="spellEnd"/>
+      <w:r>
+        <w:rPr>
+          <w:spacing w:val="-2"/>
+        </w:rPr>
+        <w:t>/</w:t>
+      </w:r>
+      <w:proofErr w:type="spellStart"/>
+      <w:r>
+        <w:rPr>
+          <w:spacing w:val="-2"/>
+        </w:rPr>
+        <w:t>auth</w:t>
+      </w:r>
+      <w:proofErr w:type="spellEnd"/>
+      <w:r>
+        <w:rPr>
+          <w:spacing w:val="-2"/>
+        </w:rPr>
+        <w:t>/</w:t>
+      </w:r>
+      <w:proofErr w:type="spellStart"/>
+      <w:r>
+        <w:rPr>
+          <w:spacing w:val="-2"/>
+        </w:rPr>
+        <w:t>login</w:t>
+      </w:r>
+      <w:proofErr w:type="spellEnd"/>
+      <w:r>
+        <w:rPr>
+          <w:spacing w:val="-2"/>
+        </w:rPr>
+        <w:t>/</w:t>
       </w:r>
     </w:p>
     <w:p>
@@ -12933,12 +13914,14 @@
         </w:rPr>
         <w:t xml:space="preserve"> </w:t>
       </w:r>
+      <w:proofErr w:type="spellStart"/>
       <w:r>
         <w:rPr>
           <w:spacing w:val="-2"/>
         </w:rPr>
         <w:t>index.tsx</w:t>
       </w:r>
+      <w:proofErr w:type="spellEnd"/>
     </w:p>
     <w:p>
       <w:pPr>
@@ -12962,39 +13945,47 @@
         </w:rPr>
         <w:t xml:space="preserve"> </w:t>
       </w:r>
+      <w:proofErr w:type="spellStart"/>
       <w:r>
         <w:t>import</w:t>
       </w:r>
+      <w:proofErr w:type="spellEnd"/>
       <w:r>
         <w:rPr>
           <w:spacing w:val="-9"/>
         </w:rPr>
         <w:t xml:space="preserve"> </w:t>
       </w:r>
+      <w:proofErr w:type="spellStart"/>
       <w:r>
         <w:t>styles</w:t>
       </w:r>
+      <w:proofErr w:type="spellEnd"/>
       <w:r>
         <w:rPr>
           <w:spacing w:val="-9"/>
         </w:rPr>
         <w:t xml:space="preserve"> </w:t>
       </w:r>
+      <w:proofErr w:type="spellStart"/>
       <w:r>
         <w:t>from</w:t>
       </w:r>
+      <w:proofErr w:type="spellEnd"/>
       <w:r>
         <w:rPr>
           <w:spacing w:val="-8"/>
         </w:rPr>
         <w:t xml:space="preserve"> </w:t>
       </w:r>
+      <w:proofErr w:type="spellStart"/>
       <w:r>
         <w:rPr>
           <w:spacing w:val="-2"/>
         </w:rPr>
         <w:t>login.module.scss</w:t>
       </w:r>
+      <w:proofErr w:type="spellEnd"/>
     </w:p>
     <w:p>
       <w:pPr>
@@ -13057,36 +14048,44 @@
           </wp:anchor>
         </w:drawing>
       </w:r>
+      <w:proofErr w:type="spellStart"/>
       <w:r>
         <w:t>Disable</w:t>
       </w:r>
+      <w:proofErr w:type="spellEnd"/>
       <w:r>
         <w:rPr>
           <w:spacing w:val="-4"/>
         </w:rPr>
         <w:t xml:space="preserve"> </w:t>
       </w:r>
+      <w:proofErr w:type="spellStart"/>
       <w:r>
         <w:t>import</w:t>
       </w:r>
+      <w:proofErr w:type="spellEnd"/>
       <w:r>
         <w:rPr>
           <w:spacing w:val="-3"/>
         </w:rPr>
         <w:t xml:space="preserve"> </w:t>
       </w:r>
+      <w:proofErr w:type="spellStart"/>
       <w:r>
         <w:t>styles</w:t>
       </w:r>
+      <w:proofErr w:type="spellEnd"/>
       <w:r>
         <w:rPr>
           <w:spacing w:val="-5"/>
         </w:rPr>
         <w:t xml:space="preserve"> </w:t>
       </w:r>
+      <w:proofErr w:type="spellStart"/>
       <w:r>
         <w:t>from</w:t>
       </w:r>
+      <w:proofErr w:type="spellEnd"/>
       <w:r>
         <w:rPr>
           <w:spacing w:val="-3"/>
@@ -13245,12 +14244,14 @@
         </w:rPr>
         <w:t xml:space="preserve"> </w:t>
       </w:r>
+      <w:proofErr w:type="spellStart"/>
       <w:r>
         <w:rPr>
           <w:spacing w:val="-2"/>
         </w:rPr>
         <w:t>login.module.scss</w:t>
       </w:r>
+      <w:proofErr w:type="spellEnd"/>
     </w:p>
     <w:p>
       <w:pPr>
@@ -13269,6 +14270,7 @@
           <w:sz w:val="21"/>
         </w:rPr>
       </w:pPr>
+      <w:proofErr w:type="spellStart"/>
       <w:r>
         <w:rPr>
           <w:rFonts w:ascii="Consolas" w:hAnsi="Consolas"/>
@@ -13277,6 +14279,7 @@
         </w:rPr>
         <w:t>background-color</w:t>
       </w:r>
+      <w:proofErr w:type="spellEnd"/>
       <w:r>
         <w:rPr>
           <w:rFonts w:ascii="Consolas" w:hAnsi="Consolas"/>
@@ -13300,8 +14303,18 @@
           <w:color w:val="795E25"/>
           <w:sz w:val="21"/>
         </w:rPr>
-        <w:t>map-get</w:t>
-      </w:r>
+        <w:t>map-</w:t>
+      </w:r>
+      <w:proofErr w:type="spellStart"/>
+      <w:r>
+        <w:rPr>
+          <w:rFonts w:ascii="Consolas" w:hAnsi="Consolas"/>
+          <w:color w:val="795E25"/>
+          <w:sz w:val="21"/>
+        </w:rPr>
+        <w:t>get</w:t>
+      </w:r>
+      <w:proofErr w:type="spellEnd"/>
       <w:r>
         <w:rPr>
           <w:rFonts w:ascii="Consolas" w:hAnsi="Consolas"/>
@@ -13341,8 +14354,18 @@
           <w:color w:val="FF0000"/>
           <w:sz w:val="21"/>
         </w:rPr>
-        <w:t>$schema</w:t>
-      </w:r>
+        <w:t>$</w:t>
+      </w:r>
+      <w:proofErr w:type="spellStart"/>
+      <w:r>
+        <w:rPr>
+          <w:rFonts w:ascii="Consolas" w:hAnsi="Consolas"/>
+          <w:color w:val="FF0000"/>
+          <w:sz w:val="21"/>
+        </w:rPr>
+        <w:t>schema</w:t>
+      </w:r>
+      <w:proofErr w:type="spellEnd"/>
       <w:r>
         <w:rPr>
           <w:rFonts w:ascii="Consolas" w:hAnsi="Consolas"/>
@@ -13366,7 +14389,16 @@
           <w:color w:val="FF0000"/>
           <w:sz w:val="21"/>
         </w:rPr>
-        <w:t>$key</w:t>
+        <w:t>$</w:t>
+      </w:r>
+      <w:proofErr w:type="spellStart"/>
+      <w:r>
+        <w:rPr>
+          <w:rFonts w:ascii="Consolas" w:hAnsi="Consolas"/>
+          <w:color w:val="FF0000"/>
+          <w:sz w:val="21"/>
+        </w:rPr>
+        <w:t>key</w:t>
       </w:r>
       <w:r>
         <w:rPr>
@@ -13385,6 +14417,7 @@
         </w:rPr>
         <w:t>secondary</w:t>
       </w:r>
+      <w:proofErr w:type="spellEnd"/>
       <w:r>
         <w:rPr>
           <w:rFonts w:ascii="Consolas" w:hAnsi="Consolas"/>
@@ -13505,6 +14538,7 @@
       </w:pPr>
       <w:r>
         <w:rPr>
+          <w:noProof/>
           <w:sz w:val="12"/>
         </w:rPr>
         <w:drawing>
@@ -13631,12 +14665,14 @@
           <w:sz w:val="20"/>
         </w:rPr>
       </w:pPr>
+      <w:proofErr w:type="spellStart"/>
       <w:r>
         <w:rPr>
           <w:spacing w:val="-2"/>
         </w:rPr>
         <w:t>Variable</w:t>
       </w:r>
+      <w:proofErr w:type="spellEnd"/>
     </w:p>
     <w:p>
       <w:pPr>
@@ -13678,8 +14714,13 @@
         </w:rPr>
         <w:t xml:space="preserve"> </w:t>
       </w:r>
-      <w:r>
-        <w:t>font,</w:t>
+      <w:proofErr w:type="spellStart"/>
+      <w:r>
+        <w:t>font</w:t>
+      </w:r>
+      <w:proofErr w:type="spellEnd"/>
+      <w:r>
+        <w:t>,</w:t>
       </w:r>
       <w:r>
         <w:rPr>
@@ -13696,9 +14737,11 @@
         </w:rPr>
         <w:t xml:space="preserve"> </w:t>
       </w:r>
+      <w:proofErr w:type="spellStart"/>
       <w:r>
         <w:t>dll</w:t>
       </w:r>
+      <w:proofErr w:type="spellEnd"/>
       <w:r>
         <w:rPr>
           <w:spacing w:val="-5"/>
@@ -13805,21 +14848,25 @@
           <w:sz w:val="20"/>
         </w:rPr>
       </w:pPr>
+      <w:proofErr w:type="spellStart"/>
       <w:r>
         <w:t>Nested</w:t>
       </w:r>
+      <w:proofErr w:type="spellEnd"/>
       <w:r>
         <w:rPr>
           <w:spacing w:val="-7"/>
         </w:rPr>
         <w:t xml:space="preserve"> </w:t>
       </w:r>
+      <w:proofErr w:type="spellStart"/>
       <w:r>
         <w:rPr>
           <w:spacing w:val="-4"/>
         </w:rPr>
         <w:t>rule</w:t>
       </w:r>
+      <w:proofErr w:type="spellEnd"/>
     </w:p>
     <w:p>
       <w:pPr>
@@ -13951,9 +14998,11 @@
           <w:sz w:val="20"/>
         </w:rPr>
       </w:pPr>
+      <w:proofErr w:type="spellStart"/>
       <w:r>
         <w:t>Maintainable</w:t>
       </w:r>
+      <w:proofErr w:type="spellEnd"/>
       <w:r>
         <w:rPr>
           <w:spacing w:val="-6"/>
@@ -13969,9 +15018,11 @@
         </w:rPr>
         <w:t xml:space="preserve"> </w:t>
       </w:r>
+      <w:proofErr w:type="spellStart"/>
       <w:r>
         <w:t>project</w:t>
       </w:r>
+      <w:proofErr w:type="spellEnd"/>
       <w:r>
         <w:rPr>
           <w:spacing w:val="-5"/>
@@ -14351,7 +15402,7 @@
           </mc:Choice>
           <mc:Fallback>
             <w:pict>
-              <v:group w14:anchorId="60A20D0A" id="Group 122" o:spid="_x0000_s1026" style="position:absolute;margin-left:1in;margin-top:18.35pt;width:451.4pt;height:1.6pt;z-index:-15709696;mso-wrap-distance-left:0;mso-wrap-distance-right:0;mso-position-horizontal-relative:page" coordsize="57327,203" o:gfxdata="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">
+              <v:group w14:anchorId="50BCFE7A" id="Group 122" o:spid="_x0000_s1026" style="position:absolute;margin-left:1in;margin-top:18.35pt;width:451.4pt;height:1.6pt;z-index:-15709696;mso-wrap-distance-left:0;mso-wrap-distance-right:0;mso-position-horizontal-relative:page" coordsize="57327,203" o:gfxdata="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">
                 <v:shape id="Graphic 123" o:spid="_x0000_s1027" style="position:absolute;width:57315;height:190;visibility:visible;mso-wrap-style:square;v-text-anchor:top" coordsize="5731510,19050" o:gfxdata="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" path="m5731497,l,,,952,,3492,,19050r5731497,l5731497,xe" fillcolor="#9f9f9f" stroked="f">
                   <v:path arrowok="t"/>
                 </v:shape>
@@ -14406,13 +15457,22 @@
           <w:b/>
         </w:rPr>
       </w:pPr>
+      <w:proofErr w:type="spellStart"/>
       <w:r>
         <w:rPr>
           <w:b/>
           <w:spacing w:val="-2"/>
         </w:rPr>
         <w:lastRenderedPageBreak/>
-        <w:t xml:space="preserve">Tailwind </w:t>
+        <w:t>Tailwind</w:t>
+      </w:r>
+      <w:proofErr w:type="spellEnd"/>
+      <w:r>
+        <w:rPr>
+          <w:b/>
+          <w:spacing w:val="-2"/>
+        </w:rPr>
+        <w:t xml:space="preserve"> </w:t>
       </w:r>
       <w:r>
         <w:rPr>
@@ -14437,6 +15497,7 @@
           <w:b/>
         </w:rPr>
       </w:pPr>
+      <w:proofErr w:type="spellStart"/>
       <w:r>
         <w:rPr>
           <w:b/>
@@ -14444,6 +15505,7 @@
         </w:rPr>
         <w:t>Install</w:t>
       </w:r>
+      <w:proofErr w:type="spellEnd"/>
     </w:p>
     <w:p>
       <w:pPr>
@@ -14508,18 +15570,22 @@
           </wp:anchor>
         </w:drawing>
       </w:r>
+      <w:proofErr w:type="spellStart"/>
       <w:r>
         <w:t>npm</w:t>
       </w:r>
+      <w:proofErr w:type="spellEnd"/>
       <w:r>
         <w:rPr>
           <w:spacing w:val="-6"/>
         </w:rPr>
         <w:t xml:space="preserve"> </w:t>
       </w:r>
+      <w:proofErr w:type="spellStart"/>
       <w:r>
         <w:t>install</w:t>
       </w:r>
+      <w:proofErr w:type="spellEnd"/>
       <w:r>
         <w:rPr>
           <w:spacing w:val="-6"/>
@@ -14535,30 +15601,36 @@
         </w:rPr>
         <w:t xml:space="preserve"> </w:t>
       </w:r>
+      <w:proofErr w:type="spellStart"/>
       <w:r>
         <w:t>tailwindcss</w:t>
       </w:r>
+      <w:proofErr w:type="spellEnd"/>
       <w:r>
         <w:rPr>
           <w:spacing w:val="-7"/>
         </w:rPr>
         <w:t xml:space="preserve"> </w:t>
       </w:r>
+      <w:proofErr w:type="spellStart"/>
       <w:r>
         <w:t>postcss</w:t>
       </w:r>
+      <w:proofErr w:type="spellEnd"/>
       <w:r>
         <w:rPr>
           <w:spacing w:val="-6"/>
         </w:rPr>
         <w:t xml:space="preserve"> </w:t>
       </w:r>
+      <w:proofErr w:type="spellStart"/>
       <w:r>
         <w:rPr>
           <w:spacing w:val="-2"/>
         </w:rPr>
         <w:t>autoprefixer</w:t>
       </w:r>
+      <w:proofErr w:type="spellEnd"/>
     </w:p>
     <w:p>
       <w:pPr>
@@ -14575,27 +15647,33 @@
           <w:rFonts w:ascii="Symbol" w:hAnsi="Symbol"/>
         </w:rPr>
       </w:pPr>
+      <w:proofErr w:type="spellStart"/>
       <w:r>
         <w:t>npx</w:t>
       </w:r>
+      <w:proofErr w:type="spellEnd"/>
       <w:r>
         <w:rPr>
           <w:spacing w:val="-6"/>
         </w:rPr>
         <w:t xml:space="preserve"> </w:t>
       </w:r>
+      <w:proofErr w:type="spellStart"/>
       <w:r>
         <w:t>tailwindcss</w:t>
       </w:r>
+      <w:proofErr w:type="spellEnd"/>
       <w:r>
         <w:rPr>
           <w:spacing w:val="-5"/>
         </w:rPr>
         <w:t xml:space="preserve"> </w:t>
       </w:r>
+      <w:proofErr w:type="spellStart"/>
       <w:r>
         <w:t>init</w:t>
       </w:r>
+      <w:proofErr w:type="spellEnd"/>
       <w:r>
         <w:rPr>
           <w:spacing w:val="-2"/>
@@ -14643,9 +15721,11 @@
         </w:rPr>
         <w:t xml:space="preserve"> </w:t>
       </w:r>
+      <w:proofErr w:type="spellStart"/>
       <w:r>
         <w:t>error</w:t>
       </w:r>
+      <w:proofErr w:type="spellEnd"/>
       <w:r>
         <w:rPr>
           <w:spacing w:val="-7"/>
@@ -14749,9 +15829,11 @@
         </w:rPr>
         <w:t xml:space="preserve"> </w:t>
       </w:r>
+      <w:proofErr w:type="spellStart"/>
       <w:r>
         <w:t>downgrade</w:t>
       </w:r>
+      <w:proofErr w:type="spellEnd"/>
       <w:r>
         <w:rPr>
           <w:spacing w:val="-8"/>
@@ -14767,21 +15849,25 @@
         </w:rPr>
         <w:t xml:space="preserve"> </w:t>
       </w:r>
+      <w:proofErr w:type="spellStart"/>
       <w:r>
         <w:t>tailwindcss</w:t>
       </w:r>
+      <w:proofErr w:type="spellEnd"/>
       <w:r>
         <w:rPr>
           <w:spacing w:val="-8"/>
         </w:rPr>
         <w:t xml:space="preserve"> </w:t>
       </w:r>
+      <w:proofErr w:type="spellStart"/>
       <w:r>
         <w:rPr>
           <w:spacing w:val="-5"/>
         </w:rPr>
         <w:t>nya</w:t>
       </w:r>
+      <w:proofErr w:type="spellEnd"/>
     </w:p>
     <w:p>
       <w:pPr>
@@ -14969,12 +16055,14 @@
           <w:b/>
         </w:rPr>
       </w:pPr>
+      <w:proofErr w:type="spellStart"/>
       <w:r>
         <w:rPr>
           <w:b/>
         </w:rPr>
         <w:t>Import</w:t>
       </w:r>
+      <w:proofErr w:type="spellEnd"/>
       <w:r>
         <w:rPr>
           <w:b/>
@@ -15038,11 +16126,19 @@
         </w:rPr>
         <w:t xml:space="preserve"> </w:t>
       </w:r>
-      <w:r>
-        <w:rPr>
-          <w:spacing w:val="-2"/>
-        </w:rPr>
-        <w:t>base;</w:t>
+      <w:proofErr w:type="spellStart"/>
+      <w:r>
+        <w:rPr>
+          <w:spacing w:val="-2"/>
+        </w:rPr>
+        <w:t>base</w:t>
+      </w:r>
+      <w:proofErr w:type="spellEnd"/>
+      <w:r>
+        <w:rPr>
+          <w:spacing w:val="-2"/>
+        </w:rPr>
+        <w:t>;</w:t>
       </w:r>
     </w:p>
     <w:p>
@@ -15067,11 +16163,19 @@
         </w:rPr>
         <w:t xml:space="preserve"> </w:t>
       </w:r>
-      <w:r>
-        <w:rPr>
-          <w:spacing w:val="-2"/>
-        </w:rPr>
-        <w:t>components;</w:t>
+      <w:proofErr w:type="spellStart"/>
+      <w:r>
+        <w:rPr>
+          <w:spacing w:val="-2"/>
+        </w:rPr>
+        <w:t>components</w:t>
+      </w:r>
+      <w:proofErr w:type="spellEnd"/>
+      <w:r>
+        <w:rPr>
+          <w:spacing w:val="-2"/>
+        </w:rPr>
+        <w:t>;</w:t>
       </w:r>
     </w:p>
     <w:p>
@@ -15096,11 +16200,19 @@
         </w:rPr>
         <w:t xml:space="preserve"> </w:t>
       </w:r>
-      <w:r>
-        <w:rPr>
-          <w:spacing w:val="-2"/>
-        </w:rPr>
-        <w:t>utilities;</w:t>
+      <w:proofErr w:type="spellStart"/>
+      <w:r>
+        <w:rPr>
+          <w:spacing w:val="-2"/>
+        </w:rPr>
+        <w:t>utilities</w:t>
+      </w:r>
+      <w:proofErr w:type="spellEnd"/>
+      <w:r>
+        <w:rPr>
+          <w:spacing w:val="-2"/>
+        </w:rPr>
+        <w:t>;</w:t>
       </w:r>
     </w:p>
     <w:p>
@@ -15225,9 +16337,11 @@
         </w:rPr>
         <w:t xml:space="preserve"> </w:t>
       </w:r>
+      <w:proofErr w:type="spellStart"/>
       <w:r>
         <w:t>index.tsx</w:t>
       </w:r>
+      <w:proofErr w:type="spellEnd"/>
       <w:r>
         <w:rPr>
           <w:spacing w:val="-7"/>
@@ -15252,11 +16366,33 @@
         </w:rPr>
         <w:t xml:space="preserve"> </w:t>
       </w:r>
-      <w:r>
-        <w:rPr>
-          <w:spacing w:val="-2"/>
-        </w:rPr>
-        <w:t>auth/login/</w:t>
+      <w:proofErr w:type="spellStart"/>
+      <w:r>
+        <w:rPr>
+          <w:spacing w:val="-2"/>
+        </w:rPr>
+        <w:t>auth</w:t>
+      </w:r>
+      <w:proofErr w:type="spellEnd"/>
+      <w:r>
+        <w:rPr>
+          <w:spacing w:val="-2"/>
+        </w:rPr>
+        <w:t>/</w:t>
+      </w:r>
+      <w:proofErr w:type="spellStart"/>
+      <w:r>
+        <w:rPr>
+          <w:spacing w:val="-2"/>
+        </w:rPr>
+        <w:t>login</w:t>
+      </w:r>
+      <w:proofErr w:type="spellEnd"/>
+      <w:r>
+        <w:rPr>
+          <w:spacing w:val="-2"/>
+        </w:rPr>
+        <w:t>/</w:t>
       </w:r>
     </w:p>
     <w:p>
@@ -15293,6 +16429,7 @@
         </w:rPr>
         <w:t xml:space="preserve"> </w:t>
       </w:r>
+      <w:proofErr w:type="spellStart"/>
       <w:r>
         <w:rPr>
           <w:rFonts w:ascii="Consolas" w:hAnsi="Consolas"/>
@@ -15301,6 +16438,7 @@
         </w:rPr>
         <w:t>className</w:t>
       </w:r>
+      <w:proofErr w:type="spellEnd"/>
       <w:r>
         <w:rPr>
           <w:rFonts w:ascii="Consolas" w:hAnsi="Consolas"/>
@@ -15325,6 +16463,7 @@
         </w:rPr>
         <w:t xml:space="preserve"> </w:t>
       </w:r>
+      <w:proofErr w:type="spellStart"/>
       <w:r>
         <w:rPr>
           <w:rFonts w:ascii="Consolas" w:hAnsi="Consolas"/>
@@ -15333,6 +16472,7 @@
         </w:rPr>
         <w:t>font-bold</w:t>
       </w:r>
+      <w:proofErr w:type="spellEnd"/>
       <w:r>
         <w:rPr>
           <w:rFonts w:ascii="Consolas" w:hAnsi="Consolas"/>
@@ -15382,6 +16522,7 @@
         </w:rPr>
         <w:t xml:space="preserve">Halaman </w:t>
       </w:r>
+      <w:proofErr w:type="spellStart"/>
       <w:r>
         <w:rPr>
           <w:rFonts w:ascii="Consolas" w:hAnsi="Consolas"/>
@@ -15390,6 +16531,7 @@
         </w:rPr>
         <w:t>Login</w:t>
       </w:r>
+      <w:proofErr w:type="spellEnd"/>
       <w:r>
         <w:rPr>
           <w:rFonts w:ascii="Consolas" w:hAnsi="Consolas"/>
@@ -15472,59 +16614,10 @@
           <w:rFonts w:ascii="Symbol" w:hAnsi="Symbol"/>
           <w:noProof/>
         </w:rPr>
-        <w:drawing>
-          <wp:anchor distT="0" distB="0" distL="0" distR="0" simplePos="0" relativeHeight="487609344" behindDoc="1" locked="0" layoutInCell="1" allowOverlap="1" wp14:anchorId="4990EBAC" wp14:editId="57AE0E9C">
-            <wp:simplePos x="0" y="0"/>
-            <wp:positionH relativeFrom="page">
-              <wp:posOffset>1371600</wp:posOffset>
-            </wp:positionH>
-            <wp:positionV relativeFrom="paragraph">
-              <wp:posOffset>316886</wp:posOffset>
-            </wp:positionV>
-            <wp:extent cx="3630385" cy="2354199"/>
-            <wp:effectExtent l="0" t="0" r="0" b="0"/>
-            <wp:wrapTopAndBottom/>
-            <wp:docPr id="135" name="Image 135"/>
-            <wp:cNvGraphicFramePr>
-              <a:graphicFrameLocks xmlns:a="http://schemas.openxmlformats.org/drawingml/2006/main"/>
-            </wp:cNvGraphicFramePr>
-            <a:graphic xmlns:a="http://schemas.openxmlformats.org/drawingml/2006/main">
-              <a:graphicData uri="http://schemas.openxmlformats.org/drawingml/2006/picture">
-                <pic:pic xmlns:pic="http://schemas.openxmlformats.org/drawingml/2006/picture">
-                  <pic:nvPicPr>
-                    <pic:cNvPr id="135" name="Image 135"/>
-                    <pic:cNvPicPr/>
-                  </pic:nvPicPr>
-                  <pic:blipFill>
-                    <a:blip r:embed="rId52" cstate="print"/>
-                    <a:stretch>
-                      <a:fillRect/>
-                    </a:stretch>
-                  </pic:blipFill>
-                  <pic:spPr>
-                    <a:xfrm>
-                      <a:off x="0" y="0"/>
-                      <a:ext cx="3630385" cy="2354199"/>
-                    </a:xfrm>
-                    <a:prstGeom prst="rect">
-                      <a:avLst/>
-                    </a:prstGeom>
-                  </pic:spPr>
-                </pic:pic>
-              </a:graphicData>
-            </a:graphic>
-          </wp:anchor>
-        </w:drawing>
-      </w:r>
-      <w:r>
-        <w:rPr>
-          <w:rFonts w:ascii="Symbol" w:hAnsi="Symbol"/>
-          <w:noProof/>
-        </w:rPr>
         <mc:AlternateContent>
           <mc:Choice Requires="wpg">
             <w:drawing>
-              <wp:anchor distT="0" distB="0" distL="0" distR="0" simplePos="0" relativeHeight="487609856" behindDoc="1" locked="0" layoutInCell="1" allowOverlap="1" wp14:anchorId="4B734A71" wp14:editId="20FBADBD">
+              <wp:anchor distT="0" distB="0" distL="0" distR="0" simplePos="0" relativeHeight="487609856" behindDoc="1" locked="0" layoutInCell="1" allowOverlap="1" wp14:anchorId="4B734A71" wp14:editId="03D8624E">
                 <wp:simplePos x="0" y="0"/>
                 <wp:positionH relativeFrom="page">
                   <wp:posOffset>914400</wp:posOffset>
@@ -15873,7 +16966,7 @@
           </mc:Choice>
           <mc:Fallback>
             <w:pict>
-              <v:group w14:anchorId="3E02C6B8" id="Group 136" o:spid="_x0000_s1026" style="position:absolute;margin-left:1in;margin-top:230.85pt;width:451.4pt;height:1.6pt;z-index:-15706624;mso-wrap-distance-left:0;mso-wrap-distance-right:0;mso-position-horizontal-relative:page" coordsize="57327,203" o:gfxdata="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">
+              <v:group w14:anchorId="36773379" id="Group 136" o:spid="_x0000_s1026" style="position:absolute;margin-left:1in;margin-top:230.85pt;width:451.4pt;height:1.6pt;z-index:-15706624;mso-wrap-distance-left:0;mso-wrap-distance-right:0;mso-position-horizontal-relative:page" coordsize="57327,203" o:gfxdata="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">
                 <v:shape id="Graphic 137" o:spid="_x0000_s1027" style="position:absolute;width:57315;height:190;visibility:visible;mso-wrap-style:square;v-text-anchor:top" coordsize="5731510,19050" o:gfxdata="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" path="m5731497,l,,,952,,3492,,19050r5731497,l5731497,xe" fillcolor="#9f9f9f" stroked="f">
                   <v:path arrowok="t"/>
                 </v:shape>
@@ -15916,6 +17009,70 @@
     </w:p>
     <w:p>
       <w:pPr>
+        <w:pStyle w:val="DaftarParagraf"/>
+        <w:tabs>
+          <w:tab w:val="left" w:pos="743"/>
+        </w:tabs>
+        <w:spacing w:before="199"/>
+        <w:ind w:firstLine="0"/>
+        <w:rPr>
+          <w:rFonts w:ascii="Symbol" w:hAnsi="Symbol"/>
+        </w:rPr>
+      </w:pPr>
+      <w:r>
+        <w:rPr>
+          <w:rFonts w:ascii="Symbol" w:hAnsi="Symbol"/>
+        </w:rPr>
+        <w:drawing>
+          <wp:inline distT="0" distB="0" distL="0" distR="0" wp14:anchorId="02F9544A" wp14:editId="59506FB4">
+            <wp:extent cx="3169100" cy="2214645"/>
+            <wp:effectExtent l="0" t="0" r="0" b="0"/>
+            <wp:docPr id="836573921" name="Gambar 1"/>
+            <wp:cNvGraphicFramePr>
+              <a:graphicFrameLocks xmlns:a="http://schemas.openxmlformats.org/drawingml/2006/main" noChangeAspect="1"/>
+            </wp:cNvGraphicFramePr>
+            <a:graphic xmlns:a="http://schemas.openxmlformats.org/drawingml/2006/main">
+              <a:graphicData uri="http://schemas.openxmlformats.org/drawingml/2006/picture">
+                <pic:pic xmlns:pic="http://schemas.openxmlformats.org/drawingml/2006/picture">
+                  <pic:nvPicPr>
+                    <pic:cNvPr id="836573921" name=""/>
+                    <pic:cNvPicPr/>
+                  </pic:nvPicPr>
+                  <pic:blipFill>
+                    <a:blip r:embed="rId52"/>
+                    <a:stretch>
+                      <a:fillRect/>
+                    </a:stretch>
+                  </pic:blipFill>
+                  <pic:spPr>
+                    <a:xfrm>
+                      <a:off x="0" y="0"/>
+                      <a:ext cx="3227504" cy="2255459"/>
+                    </a:xfrm>
+                    <a:prstGeom prst="rect">
+                      <a:avLst/>
+                    </a:prstGeom>
+                  </pic:spPr>
+                </pic:pic>
+              </a:graphicData>
+            </a:graphic>
+          </wp:inline>
+        </w:drawing>
+      </w:r>
+    </w:p>
+    <w:p>
+      <w:pPr>
+        <w:tabs>
+          <w:tab w:val="left" w:pos="743"/>
+        </w:tabs>
+        <w:spacing w:before="199"/>
+        <w:rPr>
+          <w:rFonts w:ascii="Symbol" w:hAnsi="Symbol"/>
+        </w:rPr>
+      </w:pPr>
+    </w:p>
+    <w:p>
+      <w:pPr>
         <w:pStyle w:val="TeksIsi"/>
         <w:spacing w:before="142"/>
         <w:ind w:left="0"/>
@@ -16069,8 +17226,72 @@
         </w:rPr>
         <w:t xml:space="preserve"> </w:t>
       </w:r>
-      <w:r>
-        <w:t>Module Tugas 2</w:t>
+      <w:proofErr w:type="spellStart"/>
+      <w:r>
+        <w:t>Module</w:t>
+      </w:r>
+      <w:proofErr w:type="spellEnd"/>
+      <w:r>
+        <w:t xml:space="preserve"> </w:t>
+      </w:r>
+    </w:p>
+    <w:p>
+      <w:pPr>
+        <w:pStyle w:val="DaftarParagraf"/>
+        <w:tabs>
+          <w:tab w:val="left" w:pos="743"/>
+        </w:tabs>
+        <w:spacing w:before="181" w:line="403" w:lineRule="auto"/>
+        <w:ind w:left="383" w:right="7128" w:firstLine="0"/>
+      </w:pPr>
+      <w:r>
+        <w:drawing>
+          <wp:inline distT="0" distB="0" distL="0" distR="0" wp14:anchorId="330D08F2" wp14:editId="71D6E2A1">
+            <wp:extent cx="3623556" cy="2016378"/>
+            <wp:effectExtent l="0" t="0" r="0" b="3175"/>
+            <wp:docPr id="2103318449" name="Gambar 1"/>
+            <wp:cNvGraphicFramePr>
+              <a:graphicFrameLocks xmlns:a="http://schemas.openxmlformats.org/drawingml/2006/main" noChangeAspect="1"/>
+            </wp:cNvGraphicFramePr>
+            <a:graphic xmlns:a="http://schemas.openxmlformats.org/drawingml/2006/main">
+              <a:graphicData uri="http://schemas.openxmlformats.org/drawingml/2006/picture">
+                <pic:pic xmlns:pic="http://schemas.openxmlformats.org/drawingml/2006/picture">
+                  <pic:nvPicPr>
+                    <pic:cNvPr id="2103318449" name=""/>
+                    <pic:cNvPicPr/>
+                  </pic:nvPicPr>
+                  <pic:blipFill>
+                    <a:blip r:embed="rId53"/>
+                    <a:stretch>
+                      <a:fillRect/>
+                    </a:stretch>
+                  </pic:blipFill>
+                  <pic:spPr>
+                    <a:xfrm>
+                      <a:off x="0" y="0"/>
+                      <a:ext cx="3635752" cy="2023165"/>
+                    </a:xfrm>
+                    <a:prstGeom prst="rect">
+                      <a:avLst/>
+                    </a:prstGeom>
+                  </pic:spPr>
+                </pic:pic>
+              </a:graphicData>
+            </a:graphic>
+          </wp:inline>
+        </w:drawing>
+      </w:r>
+    </w:p>
+    <w:p>
+      <w:pPr>
+        <w:tabs>
+          <w:tab w:val="left" w:pos="743"/>
+        </w:tabs>
+        <w:spacing w:before="181" w:line="403" w:lineRule="auto"/>
+        <w:ind w:left="23" w:right="7128"/>
+      </w:pPr>
+      <w:r>
+        <w:t>Tugas 2</w:t>
       </w:r>
     </w:p>
     <w:p>
@@ -16086,9 +17307,11 @@
         <w:spacing w:before="0" w:line="266" w:lineRule="exact"/>
         <w:ind w:left="743"/>
       </w:pPr>
+      <w:proofErr w:type="spellStart"/>
       <w:r>
         <w:t>Refactor</w:t>
       </w:r>
+      <w:proofErr w:type="spellEnd"/>
       <w:r>
         <w:rPr>
           <w:spacing w:val="-9"/>
@@ -16131,12 +17354,14 @@
         </w:rPr>
         <w:t xml:space="preserve"> </w:t>
       </w:r>
+      <w:proofErr w:type="spellStart"/>
       <w:r>
         <w:rPr>
           <w:spacing w:val="-4"/>
         </w:rPr>
         <w:t>views</w:t>
       </w:r>
+      <w:proofErr w:type="spellEnd"/>
     </w:p>
     <w:p>
       <w:pPr>
@@ -16169,9 +17394,11 @@
         </w:rPr>
         <w:t xml:space="preserve"> </w:t>
       </w:r>
+      <w:proofErr w:type="spellStart"/>
       <w:r>
         <w:t>Section</w:t>
       </w:r>
+      <w:proofErr w:type="spellEnd"/>
       <w:r>
         <w:rPr>
           <w:spacing w:val="-10"/>
@@ -16196,8 +17423,71 @@
         </w:rPr>
         <w:t xml:space="preserve"> </w:t>
       </w:r>
-      <w:r>
-        <w:t>Section Tugas 3</w:t>
+      <w:proofErr w:type="spellStart"/>
+      <w:r>
+        <w:t>Section</w:t>
+      </w:r>
+      <w:proofErr w:type="spellEnd"/>
+      <w:r>
+        <w:t xml:space="preserve"> </w:t>
+      </w:r>
+    </w:p>
+    <w:p>
+      <w:pPr>
+        <w:tabs>
+          <w:tab w:val="left" w:pos="743"/>
+        </w:tabs>
+        <w:spacing w:before="179" w:line="403" w:lineRule="auto"/>
+        <w:ind w:right="5452"/>
+      </w:pPr>
+      <w:r>
+        <w:drawing>
+          <wp:inline distT="0" distB="0" distL="0" distR="0" wp14:anchorId="3029FEE5" wp14:editId="2BF9A08D">
+            <wp:extent cx="3566039" cy="1727962"/>
+            <wp:effectExtent l="0" t="0" r="0" b="5715"/>
+            <wp:docPr id="1429840690" name="Gambar 1"/>
+            <wp:cNvGraphicFramePr>
+              <a:graphicFrameLocks xmlns:a="http://schemas.openxmlformats.org/drawingml/2006/main" noChangeAspect="1"/>
+            </wp:cNvGraphicFramePr>
+            <a:graphic xmlns:a="http://schemas.openxmlformats.org/drawingml/2006/main">
+              <a:graphicData uri="http://schemas.openxmlformats.org/drawingml/2006/picture">
+                <pic:pic xmlns:pic="http://schemas.openxmlformats.org/drawingml/2006/picture">
+                  <pic:nvPicPr>
+                    <pic:cNvPr id="1429840690" name=""/>
+                    <pic:cNvPicPr/>
+                  </pic:nvPicPr>
+                  <pic:blipFill>
+                    <a:blip r:embed="rId54"/>
+                    <a:stretch>
+                      <a:fillRect/>
+                    </a:stretch>
+                  </pic:blipFill>
+                  <pic:spPr>
+                    <a:xfrm>
+                      <a:off x="0" y="0"/>
+                      <a:ext cx="3570770" cy="1730254"/>
+                    </a:xfrm>
+                    <a:prstGeom prst="rect">
+                      <a:avLst/>
+                    </a:prstGeom>
+                  </pic:spPr>
+                </pic:pic>
+              </a:graphicData>
+            </a:graphic>
+          </wp:inline>
+        </w:drawing>
+      </w:r>
+    </w:p>
+    <w:p>
+      <w:pPr>
+        <w:tabs>
+          <w:tab w:val="left" w:pos="743"/>
+        </w:tabs>
+        <w:spacing w:before="179" w:line="403" w:lineRule="auto"/>
+        <w:ind w:left="23" w:right="5452"/>
+      </w:pPr>
+      <w:r>
+        <w:t>Tugas 3</w:t>
       </w:r>
     </w:p>
     <w:p>
@@ -16225,12 +17515,14 @@
         </w:rPr>
         <w:t xml:space="preserve"> </w:t>
       </w:r>
+      <w:proofErr w:type="spellStart"/>
       <w:r>
         <w:rPr>
           <w:spacing w:val="-4"/>
         </w:rPr>
         <w:t>Tailwind</w:t>
       </w:r>
+      <w:proofErr w:type="spellEnd"/>
       <w:r>
         <w:rPr>
           <w:spacing w:val="4"/>
@@ -16283,20 +17575,74 @@
         </w:rPr>
         <w:t xml:space="preserve"> </w:t>
       </w:r>
+      <w:proofErr w:type="spellStart"/>
       <w:r>
         <w:t>utility</w:t>
       </w:r>
+      <w:proofErr w:type="spellEnd"/>
       <w:r>
         <w:rPr>
           <w:spacing w:val="-3"/>
         </w:rPr>
         <w:t xml:space="preserve"> </w:t>
       </w:r>
+      <w:proofErr w:type="spellStart"/>
       <w:r>
         <w:rPr>
           <w:spacing w:val="-2"/>
         </w:rPr>
         <w:t>class</w:t>
+      </w:r>
+      <w:proofErr w:type="spellEnd"/>
+    </w:p>
+    <w:p>
+      <w:pPr>
+        <w:pStyle w:val="DaftarParagraf"/>
+        <w:numPr>
+          <w:ilvl w:val="0"/>
+          <w:numId w:val="3"/>
+        </w:numPr>
+        <w:tabs>
+          <w:tab w:val="left" w:pos="743"/>
+        </w:tabs>
+        <w:ind w:left="743"/>
+      </w:pPr>
+      <w:r>
+        <w:drawing>
+          <wp:inline distT="0" distB="0" distL="0" distR="0" wp14:anchorId="0BDE6E27" wp14:editId="54AC4C57">
+            <wp:extent cx="5193364" cy="1825241"/>
+            <wp:effectExtent l="0" t="0" r="7620" b="3810"/>
+            <wp:docPr id="333749604" name="Gambar 1"/>
+            <wp:cNvGraphicFramePr>
+              <a:graphicFrameLocks xmlns:a="http://schemas.openxmlformats.org/drawingml/2006/main" noChangeAspect="1"/>
+            </wp:cNvGraphicFramePr>
+            <a:graphic xmlns:a="http://schemas.openxmlformats.org/drawingml/2006/main">
+              <a:graphicData uri="http://schemas.openxmlformats.org/drawingml/2006/picture">
+                <pic:pic xmlns:pic="http://schemas.openxmlformats.org/drawingml/2006/picture">
+                  <pic:nvPicPr>
+                    <pic:cNvPr id="333749604" name=""/>
+                    <pic:cNvPicPr/>
+                  </pic:nvPicPr>
+                  <pic:blipFill>
+                    <a:blip r:embed="rId55"/>
+                    <a:stretch>
+                      <a:fillRect/>
+                    </a:stretch>
+                  </pic:blipFill>
+                  <pic:spPr>
+                    <a:xfrm>
+                      <a:off x="0" y="0"/>
+                      <a:ext cx="5222507" cy="1835483"/>
+                    </a:xfrm>
+                    <a:prstGeom prst="rect">
+                      <a:avLst/>
+                    </a:prstGeom>
+                  </pic:spPr>
+                </pic:pic>
+              </a:graphicData>
+            </a:graphic>
+          </wp:inline>
+        </w:drawing>
       </w:r>
     </w:p>
     <w:p>
@@ -16665,7 +18011,7 @@
           </mc:Choice>
           <mc:Fallback>
             <w:pict>
-              <v:group w14:anchorId="5B99B02E" id="Group 143" o:spid="_x0000_s1026" style="position:absolute;margin-left:1in;margin-top:18.45pt;width:451.4pt;height:1.55pt;z-index:-15706112;mso-wrap-distance-left:0;mso-wrap-distance-right:0;mso-position-horizontal-relative:page" coordsize="57327,196" o:gfxdata="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">
+              <v:group w14:anchorId="44AA8793" id="Group 143" o:spid="_x0000_s1026" style="position:absolute;margin-left:1in;margin-top:18.45pt;width:451.4pt;height:1.55pt;z-index:-15706112;mso-wrap-distance-left:0;mso-wrap-distance-right:0;mso-position-horizontal-relative:page" coordsize="57327,196" o:gfxdata="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">
                 <v:shape id="Graphic 144" o:spid="_x0000_s1027" style="position:absolute;width:57315;height:190;visibility:visible;mso-wrap-style:square;v-text-anchor:top" coordsize="5731510,19050" o:gfxdata="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" path="m5731497,l,,,266,,2794,,19050r5731497,l5731497,xe" fillcolor="#9f9f9f" stroked="f">
                   <v:path arrowok="t"/>
                 </v:shape>
@@ -16708,6 +18054,7 @@
         <w:rPr>
           <w:spacing w:val="-2"/>
         </w:rPr>
+        <w:lastRenderedPageBreak/>
         <w:t>Pertanyaan</w:t>
       </w:r>
       <w:r>
@@ -16771,9 +18118,11 @@
         </w:rPr>
         <w:t xml:space="preserve"> </w:t>
       </w:r>
+      <w:proofErr w:type="spellStart"/>
       <w:r>
         <w:t>Module</w:t>
       </w:r>
+      <w:proofErr w:type="spellEnd"/>
       <w:r>
         <w:rPr>
           <w:spacing w:val="-8"/>
@@ -16835,20 +18184,30 @@
         </w:rPr>
         <w:t xml:space="preserve"> </w:t>
       </w:r>
+      <w:proofErr w:type="spellStart"/>
       <w:r>
         <w:t>inline</w:t>
       </w:r>
+      <w:proofErr w:type="spellEnd"/>
       <w:r>
         <w:rPr>
           <w:spacing w:val="-6"/>
         </w:rPr>
         <w:t xml:space="preserve"> </w:t>
       </w:r>
-      <w:r>
-        <w:rPr>
-          <w:spacing w:val="-2"/>
-        </w:rPr>
-        <w:t>styling?</w:t>
+      <w:proofErr w:type="spellStart"/>
+      <w:r>
+        <w:rPr>
+          <w:spacing w:val="-2"/>
+        </w:rPr>
+        <w:t>styling</w:t>
+      </w:r>
+      <w:proofErr w:type="spellEnd"/>
+      <w:r>
+        <w:rPr>
+          <w:spacing w:val="-2"/>
+        </w:rPr>
+        <w:t>?</w:t>
       </w:r>
     </w:p>
     <w:p>
@@ -16900,9 +18259,11 @@
         </w:rPr>
         <w:t xml:space="preserve"> </w:t>
       </w:r>
+      <w:proofErr w:type="spellStart"/>
       <w:r>
         <w:t>project</w:t>
       </w:r>
+      <w:proofErr w:type="spellEnd"/>
       <w:r>
         <w:rPr>
           <w:spacing w:val="-4"/>
@@ -16955,9 +18316,11 @@
         </w:rPr>
         <w:t xml:space="preserve"> </w:t>
       </w:r>
+      <w:proofErr w:type="spellStart"/>
       <w:r>
         <w:t>Tailwind</w:t>
       </w:r>
+      <w:proofErr w:type="spellEnd"/>
       <w:r>
         <w:rPr>
           <w:spacing w:val="-10"/>
@@ -16987,6 +18350,198 @@
           <w:spacing w:val="-2"/>
         </w:rPr>
         <w:t>tradisional?</w:t>
+      </w:r>
+    </w:p>
+    <w:p>
+      <w:pPr>
+        <w:pStyle w:val="DaftarParagraf"/>
+        <w:numPr>
+          <w:ilvl w:val="0"/>
+          <w:numId w:val="1"/>
+        </w:numPr>
+        <w:tabs>
+          <w:tab w:val="left" w:pos="741"/>
+        </w:tabs>
+      </w:pPr>
+      <w:r>
+        <w:rPr>
+          <w:spacing w:val="-2"/>
+        </w:rPr>
+        <w:t>Jawaban</w:t>
+      </w:r>
+    </w:p>
+    <w:p>
+      <w:pPr>
+        <w:pStyle w:val="DaftarParagraf"/>
+        <w:numPr>
+          <w:ilvl w:val="1"/>
+          <w:numId w:val="1"/>
+        </w:numPr>
+        <w:tabs>
+          <w:tab w:val="left" w:pos="741"/>
+        </w:tabs>
+      </w:pPr>
+      <w:r>
+        <w:t xml:space="preserve">CSS </w:t>
+      </w:r>
+      <w:proofErr w:type="spellStart"/>
+      <w:r>
+        <w:t>Module</w:t>
+      </w:r>
+      <w:proofErr w:type="spellEnd"/>
+      <w:r>
+        <w:t xml:space="preserve"> sebaiknya digunakan ketika membuat komponen yang terpisah agar </w:t>
+      </w:r>
+      <w:proofErr w:type="spellStart"/>
+      <w:r>
+        <w:t>style</w:t>
+      </w:r>
+      <w:proofErr w:type="spellEnd"/>
+      <w:r>
+        <w:t xml:space="preserve"> tidak saling bertabrakan, sedangkan Global CSS digunakan untuk </w:t>
+      </w:r>
+      <w:proofErr w:type="spellStart"/>
+      <w:r>
+        <w:t>style</w:t>
+      </w:r>
+      <w:proofErr w:type="spellEnd"/>
+      <w:r>
+        <w:t xml:space="preserve"> umum yang berlaku di seluruh halaman.</w:t>
+      </w:r>
+    </w:p>
+    <w:p>
+      <w:pPr>
+        <w:pStyle w:val="DaftarParagraf"/>
+        <w:numPr>
+          <w:ilvl w:val="1"/>
+          <w:numId w:val="1"/>
+        </w:numPr>
+        <w:tabs>
+          <w:tab w:val="left" w:pos="741"/>
+        </w:tabs>
+      </w:pPr>
+      <w:proofErr w:type="spellStart"/>
+      <w:r>
+        <w:t>Inline</w:t>
+      </w:r>
+      <w:proofErr w:type="spellEnd"/>
+      <w:r>
+        <w:t xml:space="preserve"> </w:t>
+      </w:r>
+      <w:proofErr w:type="spellStart"/>
+      <w:r>
+        <w:t>styling</w:t>
+      </w:r>
+      <w:proofErr w:type="spellEnd"/>
+      <w:r>
+        <w:t xml:space="preserve"> memiliki kelemahan karena sulit dikelola, tidak mendukung pseudo-</w:t>
+      </w:r>
+      <w:proofErr w:type="spellStart"/>
+      <w:r>
+        <w:t>class</w:t>
+      </w:r>
+      <w:proofErr w:type="spellEnd"/>
+      <w:r>
+        <w:t xml:space="preserve"> seperti :</w:t>
+      </w:r>
+      <w:proofErr w:type="spellStart"/>
+      <w:r>
+        <w:t>hover</w:t>
+      </w:r>
+      <w:proofErr w:type="spellEnd"/>
+      <w:r>
+        <w:t xml:space="preserve">, tidak bisa menggunakan media </w:t>
+      </w:r>
+      <w:proofErr w:type="spellStart"/>
+      <w:r>
+        <w:t>query</w:t>
+      </w:r>
+      <w:proofErr w:type="spellEnd"/>
+      <w:r>
+        <w:t>, dan sulit digunakan kembali.</w:t>
+      </w:r>
+    </w:p>
+    <w:p>
+      <w:pPr>
+        <w:pStyle w:val="DaftarParagraf"/>
+        <w:numPr>
+          <w:ilvl w:val="1"/>
+          <w:numId w:val="1"/>
+        </w:numPr>
+        <w:tabs>
+          <w:tab w:val="left" w:pos="741"/>
+        </w:tabs>
+      </w:pPr>
+      <w:r>
+        <w:t xml:space="preserve">SCSS cocok untuk </w:t>
+      </w:r>
+      <w:proofErr w:type="spellStart"/>
+      <w:r>
+        <w:t>project</w:t>
+      </w:r>
+      <w:proofErr w:type="spellEnd"/>
+      <w:r>
+        <w:t xml:space="preserve"> skala besar karena memiliki fitur seperti </w:t>
+      </w:r>
+      <w:proofErr w:type="spellStart"/>
+      <w:r>
+        <w:t>variables</w:t>
+      </w:r>
+      <w:proofErr w:type="spellEnd"/>
+      <w:r>
+        <w:t xml:space="preserve">, </w:t>
+      </w:r>
+      <w:proofErr w:type="spellStart"/>
+      <w:r>
+        <w:t>nesting</w:t>
+      </w:r>
+      <w:proofErr w:type="spellEnd"/>
+      <w:r>
+        <w:t xml:space="preserve">, </w:t>
+      </w:r>
+      <w:proofErr w:type="spellStart"/>
+      <w:r>
+        <w:t>mixin</w:t>
+      </w:r>
+      <w:proofErr w:type="spellEnd"/>
+      <w:r>
+        <w:t xml:space="preserve">, dan </w:t>
+      </w:r>
+      <w:proofErr w:type="spellStart"/>
+      <w:r>
+        <w:t>modularisasi</w:t>
+      </w:r>
+      <w:proofErr w:type="spellEnd"/>
+      <w:r>
+        <w:t xml:space="preserve"> yang membuat CSS lebih terstruktur dan mudah dikelola.</w:t>
+      </w:r>
+    </w:p>
+    <w:p>
+      <w:pPr>
+        <w:pStyle w:val="DaftarParagraf"/>
+        <w:numPr>
+          <w:ilvl w:val="1"/>
+          <w:numId w:val="1"/>
+        </w:numPr>
+        <w:tabs>
+          <w:tab w:val="left" w:pos="741"/>
+        </w:tabs>
+      </w:pPr>
+      <w:proofErr w:type="spellStart"/>
+      <w:r>
+        <w:t>Tailwind</w:t>
+      </w:r>
+      <w:proofErr w:type="spellEnd"/>
+      <w:r>
+        <w:t xml:space="preserve"> CSS lebih unggul karena menggunakan pendekatan </w:t>
+      </w:r>
+      <w:proofErr w:type="spellStart"/>
+      <w:r>
+        <w:t>utility-first</w:t>
+      </w:r>
+      <w:proofErr w:type="spellEnd"/>
+      <w:r>
+        <w:t>, sehingga pembuatan UI lebih cepat, konsisten, dan mudah membuat desain yang responsif.</w:t>
       </w:r>
     </w:p>
     <w:p>
@@ -17355,7 +18910,7 @@
           </mc:Choice>
           <mc:Fallback>
             <w:pict>
-              <v:group w14:anchorId="65E71EC0" id="Group 150" o:spid="_x0000_s1026" style="position:absolute;margin-left:1in;margin-top:18.4pt;width:451.4pt;height:1.55pt;z-index:-15705600;mso-wrap-distance-left:0;mso-wrap-distance-right:0;mso-position-horizontal-relative:page" coordsize="57327,196" o:gfxdata="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">
+              <v:group w14:anchorId="496322C3" id="Group 150" o:spid="_x0000_s1026" style="position:absolute;margin-left:1in;margin-top:18.4pt;width:451.4pt;height:1.55pt;z-index:-15705600;mso-wrap-distance-left:0;mso-wrap-distance-right:0;mso-position-horizontal-relative:page" coordsize="57327,196" o:gfxdata="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">
                 <v:shape id="Graphic 151" o:spid="_x0000_s1027" style="position:absolute;width:57315;height:190;visibility:visible;mso-wrap-style:square;v-text-anchor:top" coordsize="5731510,19050" o:gfxdata="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" path="m5731497,l,,,635,,3175,,19050r5731497,l5731497,xe" fillcolor="#9f9f9f" stroked="f">
                   <v:path arrowok="t"/>
                 </v:shape>
@@ -17452,11 +19007,19 @@
         </w:rPr>
         <w:t xml:space="preserve"> </w:t>
       </w:r>
-      <w:r>
-        <w:rPr>
-          <w:spacing w:val="-2"/>
-        </w:rPr>
-        <w:t>styling:</w:t>
+      <w:proofErr w:type="spellStart"/>
+      <w:r>
+        <w:rPr>
+          <w:spacing w:val="-2"/>
+        </w:rPr>
+        <w:t>styling</w:t>
+      </w:r>
+      <w:proofErr w:type="spellEnd"/>
+      <w:r>
+        <w:rPr>
+          <w:spacing w:val="-2"/>
+        </w:rPr>
+        <w:t>:</w:t>
       </w:r>
     </w:p>
     <w:p>
@@ -17498,9 +19061,11 @@
         </w:rPr>
         <w:t xml:space="preserve"> </w:t>
       </w:r>
+      <w:proofErr w:type="spellStart"/>
       <w:r>
         <w:t>utility</w:t>
       </w:r>
+      <w:proofErr w:type="spellEnd"/>
       <w:r>
         <w:rPr>
           <w:spacing w:val="-1"/>
@@ -17534,9 +19099,11 @@
         </w:rPr>
         <w:t xml:space="preserve"> </w:t>
       </w:r>
+      <w:proofErr w:type="spellStart"/>
       <w:r>
         <w:t>Module</w:t>
       </w:r>
+      <w:proofErr w:type="spellEnd"/>
       <w:r>
         <w:rPr>
           <w:spacing w:val="-1"/>
@@ -17571,18 +19138,22 @@
         </w:tabs>
         <w:spacing w:before="181"/>
       </w:pPr>
+      <w:proofErr w:type="spellStart"/>
       <w:r>
         <w:t>Inline</w:t>
       </w:r>
+      <w:proofErr w:type="spellEnd"/>
       <w:r>
         <w:rPr>
           <w:spacing w:val="-1"/>
         </w:rPr>
         <w:t xml:space="preserve"> </w:t>
       </w:r>
+      <w:proofErr w:type="spellStart"/>
       <w:r>
         <w:t>Style</w:t>
       </w:r>
+      <w:proofErr w:type="spellEnd"/>
       <w:r>
         <w:rPr>
           <w:spacing w:val="-2"/>
@@ -17623,12 +19194,14 @@
       <w:r>
         <w:t xml:space="preserve">→ </w:t>
       </w:r>
+      <w:proofErr w:type="spellStart"/>
       <w:r>
         <w:rPr>
           <w:spacing w:val="-2"/>
         </w:rPr>
         <w:t>scalable</w:t>
       </w:r>
+      <w:proofErr w:type="spellEnd"/>
     </w:p>
     <w:p>
       <w:pPr>
@@ -17641,9 +19214,11 @@
           <w:tab w:val="left" w:pos="743"/>
         </w:tabs>
       </w:pPr>
+      <w:proofErr w:type="spellStart"/>
       <w:r>
         <w:t>Tailwind</w:t>
       </w:r>
+      <w:proofErr w:type="spellEnd"/>
       <w:r>
         <w:rPr>
           <w:spacing w:val="-7"/>
@@ -17717,9 +19292,11 @@
         </w:rPr>
         <w:t xml:space="preserve"> </w:t>
       </w:r>
+      <w:proofErr w:type="spellStart"/>
       <w:r>
         <w:t>styling</w:t>
       </w:r>
+      <w:proofErr w:type="spellEnd"/>
       <w:r>
         <w:rPr>
           <w:spacing w:val="-6"/>
@@ -17780,11 +19357,19 @@
         </w:rPr>
         <w:t xml:space="preserve"> </w:t>
       </w:r>
-      <w:r>
-        <w:rPr>
-          <w:spacing w:val="-2"/>
-        </w:rPr>
-        <w:t>project.</w:t>
+      <w:proofErr w:type="spellStart"/>
+      <w:r>
+        <w:rPr>
+          <w:spacing w:val="-2"/>
+        </w:rPr>
+        <w:t>project</w:t>
+      </w:r>
+      <w:proofErr w:type="spellEnd"/>
+      <w:r>
+        <w:rPr>
+          <w:spacing w:val="-2"/>
+        </w:rPr>
+        <w:t>.</w:t>
       </w:r>
     </w:p>
     <w:sectPr>
@@ -19029,7 +20614,6 @@
       <w:lvlJc w:val="left"/>
       <w:pPr>
         <w:ind w:left="256" w:hanging="234"/>
-        <w:jc w:val="left"/>
       </w:pPr>
       <w:rPr>
         <w:rFonts w:hint="default"/>
@@ -19045,7 +20629,6 @@
       <w:lvlJc w:val="left"/>
       <w:pPr>
         <w:ind w:left="743" w:hanging="360"/>
-        <w:jc w:val="left"/>
       </w:pPr>
       <w:rPr>
         <w:rFonts w:hint="default"/>
@@ -19061,7 +20644,6 @@
       <w:lvlJc w:val="left"/>
       <w:pPr>
         <w:ind w:left="238" w:hanging="360"/>
-        <w:jc w:val="left"/>
       </w:pPr>
       <w:rPr>
         <w:rFonts w:ascii="Calibri" w:eastAsia="Calibri" w:hAnsi="Calibri" w:cs="Calibri" w:hint="default"/>
@@ -19974,7 +21556,6 @@
   <w:style w:type="character" w:default="1" w:styleId="FontParagrafDefault">
     <w:name w:val="Default Paragraph Font"/>
     <w:uiPriority w:val="1"/>
-    <w:semiHidden/>
     <w:unhideWhenUsed/>
   </w:style>
   <w:style w:type="table" w:default="1" w:styleId="TabelNormal">

</xml_diff>